<commit_message>
finsihed schmatic version 2.0
</commit_message>
<xml_diff>
--- a/doc/2.Document Annexe/PV/PV_21_08_2025_2510_RegulationChauffage_Mendes.docx
+++ b/doc/2.Document Annexe/PV/PV_21_08_2025_2510_RegulationChauffage_Mendes.docx
@@ -42,7 +42,7 @@
           <w:sz w:val="32"/>
           <w:szCs w:val="32"/>
         </w:rPr>
-        <w:t>20</w:t>
+        <w:t>21</w:t>
       </w:r>
       <w:r>
         <w:rPr>
@@ -241,18 +241,70 @@
         <w:jc w:val="left"/>
         <w:rPr>
           <w:rFonts w:ascii="Helvetica" w:hAnsi="Helvetica"/>
-        </w:rPr>
-      </w:pPr>
-      <w:r>
-        <w:rPr>
-          <w:rFonts w:ascii="Helvetica" w:hAnsi="Helvetica"/>
-          <w:sz w:val="22"/>
-        </w:rPr>
-        <w:t>R</w:t>
+          <w:sz w:val="22"/>
+        </w:rPr>
+      </w:pPr>
+      <w:r>
+        <w:rPr>
+          <w:rFonts w:ascii="Helvetica" w:hAnsi="Helvetica"/>
+          <w:sz w:val="22"/>
+        </w:rPr>
+        <w:t>Phase de pré-étude et de designs</w:t>
       </w:r>
     </w:p>
     <w:p>
       <w:pPr>
+        <w:pStyle w:val="Paragraphedeliste1"/>
+        <w:numPr>
+          <w:ilvl w:val="0"/>
+          <w:numId w:val="7"/>
+        </w:numPr>
+        <w:ind w:left="0" w:firstLine="0"/>
+        <w:jc w:val="left"/>
+        <w:rPr>
+          <w:rFonts w:ascii="Helvetica" w:hAnsi="Helvetica"/>
+          <w:sz w:val="22"/>
+        </w:rPr>
+      </w:pPr>
+      <w:r>
+        <w:rPr>
+          <w:rFonts w:ascii="Helvetica" w:hAnsi="Helvetica"/>
+          <w:sz w:val="22"/>
+        </w:rPr>
+        <w:t xml:space="preserve">Présentations du schéma </w:t>
+      </w:r>
+      <w:r>
+        <w:rPr>
+          <w:rFonts w:ascii="Helvetica" w:hAnsi="Helvetica"/>
+          <w:sz w:val="22"/>
+        </w:rPr>
+        <w:t xml:space="preserve">bloc </w:t>
+      </w:r>
+    </w:p>
+    <w:p>
+      <w:pPr>
+        <w:pStyle w:val="Paragraphedeliste1"/>
+        <w:numPr>
+          <w:ilvl w:val="0"/>
+          <w:numId w:val="7"/>
+        </w:numPr>
+        <w:ind w:left="0" w:firstLine="0"/>
+        <w:jc w:val="left"/>
+        <w:rPr>
+          <w:rFonts w:ascii="Helvetica" w:hAnsi="Helvetica"/>
+          <w:sz w:val="22"/>
+        </w:rPr>
+      </w:pPr>
+      <w:r>
+        <w:rPr>
+          <w:rFonts w:ascii="Helvetica" w:hAnsi="Helvetica"/>
+          <w:sz w:val="22"/>
+        </w:rPr>
+        <w:t>Présentation du schéma</w:t>
+      </w:r>
+    </w:p>
+    <w:p>
+      <w:pPr>
         <w:pStyle w:val="Citationintense1"/>
         <w:ind w:left="0"/>
         <w:rPr>
@@ -266,48 +318,6 @@
           <w:color w:val="auto"/>
         </w:rPr>
         <w:t>Problèmes rencontrés</w:t>
-      </w:r>
-    </w:p>
-    <w:p>
-      <w:pPr>
-        <w:pStyle w:val="Paragraphedeliste1"/>
-        <w:ind w:left="284"/>
-        <w:rPr>
-          <w:rFonts w:ascii="Helvetica" w:hAnsi="Helvetica"/>
-          <w:i/>
-          <w:sz w:val="22"/>
-        </w:rPr>
-      </w:pPr>
-      <w:r>
-        <w:rPr>
-          <w:rFonts w:ascii="Helvetica" w:hAnsi="Helvetica"/>
-          <w:sz w:val="22"/>
-        </w:rPr>
-        <w:t>.</w:t>
-      </w:r>
-    </w:p>
-    <w:p>
-      <w:pPr>
-        <w:pStyle w:val="Citationintense1"/>
-        <w:ind w:left="0"/>
-        <w:rPr>
-          <w:rFonts w:ascii="Helvetica" w:hAnsi="Helvetica"/>
-          <w:color w:val="auto"/>
-        </w:rPr>
-      </w:pPr>
-      <w:r>
-        <w:rPr>
-          <w:rFonts w:ascii="Helvetica" w:hAnsi="Helvetica"/>
-          <w:color w:val="auto"/>
-        </w:rPr>
-        <w:t xml:space="preserve">Solutions </w:t>
-      </w:r>
-      <w:r>
-        <w:rPr>
-          <w:rFonts w:ascii="Helvetica" w:hAnsi="Helvetica"/>
-          <w:color w:val="auto"/>
-        </w:rPr>
-        <w:t>proposées</w:t>
       </w:r>
     </w:p>
     <w:p>
@@ -325,11 +335,178 @@
           <w:rFonts w:ascii="Helvetica" w:hAnsi="Helvetica"/>
           <w:sz w:val="22"/>
         </w:rPr>
-        <w:t>R</w:t>
+        <w:t>Question posée sur cahier des charges</w:t>
+      </w:r>
+      <w:r>
+        <w:rPr>
+          <w:rFonts w:ascii="Helvetica" w:hAnsi="Helvetica"/>
+          <w:sz w:val="22"/>
+        </w:rPr>
+        <w:t>, suite à la pré étude</w:t>
+      </w:r>
+      <w:r>
+        <w:rPr>
+          <w:rFonts w:ascii="Helvetica" w:hAnsi="Helvetica"/>
+          <w:sz w:val="22"/>
+        </w:rPr>
+        <w:t xml:space="preserve"> : </w:t>
       </w:r>
     </w:p>
     <w:p>
       <w:pPr>
+        <w:pStyle w:val="Paragraphedeliste1"/>
+        <w:numPr>
+          <w:ilvl w:val="0"/>
+          <w:numId w:val="20"/>
+        </w:numPr>
+        <w:ind w:left="426"/>
+        <w:rPr>
+          <w:rFonts w:ascii="Helvetica" w:hAnsi="Helvetica"/>
+          <w:sz w:val="22"/>
+        </w:rPr>
+      </w:pPr>
+      <w:r>
+        <w:rPr>
+          <w:rFonts w:ascii="Helvetica" w:hAnsi="Helvetica"/>
+          <w:sz w:val="22"/>
+        </w:rPr>
+        <w:t>Quel type de mémoire est prévu sur le CM5 : SD externe ou eMMC intégrée ?</w:t>
+      </w:r>
+    </w:p>
+    <w:p>
+      <w:pPr>
+        <w:pStyle w:val="Paragraphedeliste1"/>
+        <w:numPr>
+          <w:ilvl w:val="0"/>
+          <w:numId w:val="20"/>
+        </w:numPr>
+        <w:ind w:left="426"/>
+        <w:rPr>
+          <w:rFonts w:ascii="Helvetica" w:hAnsi="Helvetica"/>
+          <w:sz w:val="22"/>
+        </w:rPr>
+      </w:pPr>
+      <w:r>
+        <w:rPr>
+          <w:rFonts w:ascii="Helvetica" w:hAnsi="Helvetica"/>
+          <w:sz w:val="22"/>
+        </w:rPr>
+        <w:t>Si utilisation d’une mémoire eMMC interne, faut-il ajouter un port USB dédié à la programmation ?</w:t>
+      </w:r>
+    </w:p>
+    <w:p>
+      <w:pPr>
+        <w:pStyle w:val="Paragraphedeliste1"/>
+        <w:numPr>
+          <w:ilvl w:val="0"/>
+          <w:numId w:val="20"/>
+        </w:numPr>
+        <w:ind w:left="426"/>
+        <w:rPr>
+          <w:rFonts w:ascii="Helvetica" w:hAnsi="Helvetica"/>
+          <w:sz w:val="22"/>
+        </w:rPr>
+      </w:pPr>
+      <w:r>
+        <w:rPr>
+          <w:rFonts w:ascii="Helvetica" w:hAnsi="Helvetica"/>
+          <w:sz w:val="22"/>
+        </w:rPr>
+        <w:t>Les composants non partagés entre les cartes filles doivent-ils être placés directement sur ces mêmes cartes filles ?</w:t>
+      </w:r>
+    </w:p>
+    <w:p>
+      <w:pPr>
+        <w:pStyle w:val="Paragraphedeliste1"/>
+        <w:numPr>
+          <w:ilvl w:val="0"/>
+          <w:numId w:val="20"/>
+        </w:numPr>
+        <w:ind w:left="426"/>
+        <w:rPr>
+          <w:rFonts w:ascii="Helvetica" w:hAnsi="Helvetica"/>
+          <w:sz w:val="22"/>
+        </w:rPr>
+      </w:pPr>
+      <w:r>
+        <w:rPr>
+          <w:rFonts w:ascii="Helvetica" w:hAnsi="Helvetica"/>
+          <w:sz w:val="22"/>
+        </w:rPr>
+        <w:t>Des sondes de types différents sont-elles présentes sur une même installation ?</w:t>
+      </w:r>
+    </w:p>
+    <w:p>
+      <w:pPr>
+        <w:pStyle w:val="Paragraphedeliste1"/>
+        <w:numPr>
+          <w:ilvl w:val="0"/>
+          <w:numId w:val="20"/>
+        </w:numPr>
+        <w:ind w:left="426"/>
+        <w:rPr>
+          <w:rFonts w:ascii="Helvetica" w:hAnsi="Helvetica"/>
+          <w:sz w:val="22"/>
+        </w:rPr>
+      </w:pPr>
+      <w:r>
+        <w:rPr>
+          <w:rFonts w:ascii="Helvetica" w:hAnsi="Helvetica"/>
+          <w:sz w:val="22"/>
+        </w:rPr>
+        <w:t>Le coût du composant ADC sélectionné est-il trop élevé pour le projet ?</w:t>
+      </w:r>
+    </w:p>
+    <w:p>
+      <w:pPr>
+        <w:pStyle w:val="Paragraphedeliste1"/>
+        <w:numPr>
+          <w:ilvl w:val="0"/>
+          <w:numId w:val="20"/>
+        </w:numPr>
+        <w:ind w:left="426"/>
+        <w:rPr>
+          <w:rFonts w:ascii="Helvetica" w:hAnsi="Helvetica"/>
+          <w:sz w:val="22"/>
+        </w:rPr>
+      </w:pPr>
+      <w:r>
+        <w:rPr>
+          <w:rFonts w:ascii="Helvetica" w:hAnsi="Helvetica"/>
+          <w:sz w:val="22"/>
+        </w:rPr>
+        <w:t>L’interface Ethernet doit-elle être prévue en 4 paires (1 Gbit/s, comme sur la carte CM5IO) ou une liaison 100 Mbit/s suffit-elle ?</w:t>
+      </w:r>
+    </w:p>
+    <w:p>
+      <w:pPr>
+        <w:pStyle w:val="Paragraphedeliste1"/>
+        <w:rPr>
+          <w:rFonts w:ascii="Helvetica" w:hAnsi="Helvetica"/>
+          <w:sz w:val="22"/>
+        </w:rPr>
+      </w:pPr>
+    </w:p>
+    <w:p>
+      <w:pPr>
+        <w:pStyle w:val="Paragraphedeliste1"/>
+        <w:ind w:left="0"/>
+        <w:rPr>
+          <w:rFonts w:ascii="Helvetica" w:hAnsi="Helvetica"/>
+          <w:i/>
+          <w:sz w:val="22"/>
+        </w:rPr>
+      </w:pPr>
+      <w:r>
+        <w:rPr>
+          <w:rFonts w:ascii="Helvetica" w:hAnsi="Helvetica"/>
+          <w:sz w:val="22"/>
+        </w:rPr>
+        <w:t>Demande complémentaire : fournir la référence et le schéma de la carte LED de face avant (Oblo Base LED) afin de disposer du pinout et des informations de dimensionnement.</w:t>
+      </w:r>
+    </w:p>
+    <w:p>
+      <w:pPr>
         <w:pStyle w:val="Citationintense1"/>
         <w:ind w:left="0"/>
         <w:rPr>
@@ -342,39 +519,355 @@
           <w:rFonts w:ascii="Helvetica" w:hAnsi="Helvetica"/>
           <w:color w:val="auto"/>
         </w:rPr>
-        <w:t>Décisions prises</w:t>
+        <w:t xml:space="preserve">Solutions </w:t>
+      </w:r>
+      <w:r>
+        <w:rPr>
+          <w:rFonts w:ascii="Helvetica" w:hAnsi="Helvetica"/>
+          <w:color w:val="auto"/>
+        </w:rPr>
+        <w:t>proposées</w:t>
       </w:r>
     </w:p>
     <w:p>
       <w:pPr>
-        <w:rPr>
-          <w:rFonts w:ascii="Helvetica" w:hAnsi="Helvetica"/>
-          <w:i/>
-        </w:rPr>
-      </w:pPr>
-      <w:r>
-        <w:rPr>
-          <w:rFonts w:ascii="Helvetica" w:hAnsi="Helvetica"/>
-          <w:i/>
-        </w:rPr>
-        <w:t>D</w:t>
+        <w:pStyle w:val="Paragraphedeliste1"/>
+        <w:ind w:left="0"/>
+        <w:jc w:val="left"/>
+        <w:rPr>
+          <w:rFonts w:ascii="Helvetica" w:hAnsi="Helvetica"/>
+          <w:sz w:val="22"/>
+        </w:rPr>
+      </w:pPr>
+      <w:r>
+        <w:rPr>
+          <w:rFonts w:ascii="Helvetica" w:hAnsi="Helvetica"/>
+          <w:sz w:val="22"/>
+        </w:rPr>
+        <w:t>Réponse au</w:t>
+      </w:r>
+      <w:r>
+        <w:rPr>
+          <w:rFonts w:ascii="Helvetica" w:hAnsi="Helvetica"/>
+          <w:sz w:val="22"/>
+        </w:rPr>
+        <w:t>x</w:t>
+      </w:r>
+      <w:r>
+        <w:rPr>
+          <w:rFonts w:ascii="Helvetica" w:hAnsi="Helvetica"/>
+          <w:sz w:val="22"/>
+        </w:rPr>
+        <w:t xml:space="preserve"> question</w:t>
+      </w:r>
+      <w:r>
+        <w:rPr>
+          <w:rFonts w:ascii="Helvetica" w:hAnsi="Helvetica"/>
+          <w:sz w:val="22"/>
+        </w:rPr>
+        <w:t>s</w:t>
+      </w:r>
+      <w:r>
+        <w:rPr>
+          <w:rFonts w:ascii="Helvetica" w:hAnsi="Helvetica"/>
+          <w:sz w:val="22"/>
+        </w:rPr>
+        <w:t xml:space="preserve"> posée</w:t>
+      </w:r>
+      <w:r>
+        <w:rPr>
+          <w:rFonts w:ascii="Helvetica" w:hAnsi="Helvetica"/>
+          <w:sz w:val="22"/>
+        </w:rPr>
+        <w:t>s :</w:t>
       </w:r>
     </w:p>
     <w:p>
       <w:pPr>
-        <w:rPr>
-          <w:rFonts w:ascii="Helvetica" w:hAnsi="Helvetica"/>
-          <w:i/>
-        </w:rPr>
-      </w:pPr>
+        <w:pStyle w:val="Paragraphedeliste"/>
+        <w:numPr>
+          <w:ilvl w:val="0"/>
+          <w:numId w:val="22"/>
+        </w:numPr>
+        <w:ind w:left="426"/>
+        <w:rPr>
+          <w:rFonts w:ascii="Helvetica" w:hAnsi="Helvetica"/>
+          <w:sz w:val="22"/>
+        </w:rPr>
+      </w:pPr>
+      <w:r>
+        <w:rPr>
+          <w:rFonts w:ascii="Helvetica" w:hAnsi="Helvetica"/>
+          <w:sz w:val="22"/>
+        </w:rPr>
+        <w:t>Pour assurer une meilleure stabilité, une mémoire eMMC est demandée.</w:t>
+      </w:r>
     </w:p>
     <w:p>
       <w:pPr>
+        <w:pStyle w:val="Paragraphedeliste"/>
+        <w:numPr>
+          <w:ilvl w:val="0"/>
+          <w:numId w:val="22"/>
+        </w:numPr>
+        <w:ind w:left="426"/>
+        <w:rPr>
+          <w:rFonts w:ascii="Helvetica" w:hAnsi="Helvetica"/>
+          <w:sz w:val="22"/>
+        </w:rPr>
+      </w:pPr>
+      <w:r>
+        <w:rPr>
+          <w:rFonts w:ascii="Helvetica" w:hAnsi="Helvetica"/>
+          <w:sz w:val="22"/>
+        </w:rPr>
+        <w:t>Oui, un port USB devra être ajouté pour permettre la programmation des cartes. Attention à bien respecter le routage du pair différentiel.</w:t>
+      </w:r>
+    </w:p>
+    <w:p>
+      <w:pPr>
+        <w:pStyle w:val="Paragraphedeliste"/>
+        <w:numPr>
+          <w:ilvl w:val="0"/>
+          <w:numId w:val="22"/>
+        </w:numPr>
+        <w:ind w:left="426"/>
+        <w:rPr>
+          <w:rFonts w:ascii="Helvetica" w:hAnsi="Helvetica"/>
+          <w:sz w:val="22"/>
+        </w:rPr>
+      </w:pPr>
+      <w:r>
+        <w:rPr>
+          <w:rFonts w:ascii="Helvetica" w:hAnsi="Helvetica"/>
+          <w:sz w:val="22"/>
+        </w:rPr>
+        <w:t>Les composants spécifiques à une seule carte fille devront être placés directement sur celle-ci par logique.</w:t>
+      </w:r>
+    </w:p>
+    <w:p>
+      <w:pPr>
+        <w:pStyle w:val="Paragraphedeliste"/>
+        <w:numPr>
+          <w:ilvl w:val="0"/>
+          <w:numId w:val="22"/>
+        </w:numPr>
+        <w:ind w:left="426"/>
+        <w:rPr>
+          <w:rFonts w:ascii="Helvetica" w:hAnsi="Helvetica"/>
+          <w:sz w:val="22"/>
+        </w:rPr>
+      </w:pPr>
+      <w:r>
+        <w:rPr>
+          <w:rFonts w:ascii="Helvetica" w:hAnsi="Helvetica"/>
+          <w:sz w:val="22"/>
+        </w:rPr>
+        <w:t>Dans la pratique, différents types de sondes peuvent être présents selon les installations. Le projet doit donc être capable de prendre en compte chaque configuration.</w:t>
+      </w:r>
+    </w:p>
+    <w:p>
+      <w:pPr>
+        <w:pStyle w:val="Paragraphedeliste"/>
+        <w:numPr>
+          <w:ilvl w:val="0"/>
+          <w:numId w:val="22"/>
+        </w:numPr>
+        <w:ind w:left="426"/>
+        <w:rPr>
+          <w:rFonts w:ascii="Helvetica" w:hAnsi="Helvetica"/>
+          <w:sz w:val="22"/>
+        </w:rPr>
+      </w:pPr>
+      <w:r>
+        <w:rPr>
+          <w:rFonts w:ascii="Helvetica" w:hAnsi="Helvetica"/>
+          <w:sz w:val="22"/>
+        </w:rPr>
+        <w:t>Le système actuel est particulièrement coûteux. Une solution stable et fiable avec un prix autour d’une dizaine de francs est acceptable si elle répond correctement au cahier des charges.</w:t>
+      </w:r>
+    </w:p>
+    <w:p>
+      <w:pPr>
+        <w:pStyle w:val="Paragraphedeliste"/>
+        <w:numPr>
+          <w:ilvl w:val="0"/>
+          <w:numId w:val="22"/>
+        </w:numPr>
+        <w:ind w:left="426"/>
+        <w:rPr>
+          <w:rFonts w:ascii="Helvetica" w:hAnsi="Helvetica"/>
+          <w:sz w:val="22"/>
+        </w:rPr>
+      </w:pPr>
+      <w:r>
+        <w:rPr>
+          <w:rFonts w:ascii="Helvetica" w:hAnsi="Helvetica"/>
+          <w:sz w:val="22"/>
+        </w:rPr>
+        <w:t>Une grande rapidité de communication Ethernet n’est pas nécessaire. Une liaison à 100 Mbit/s est suffisante.</w:t>
+      </w:r>
+    </w:p>
+    <w:p>
+      <w:pPr>
+        <w:pStyle w:val="Citationintense1"/>
+        <w:ind w:left="0"/>
+        <w:rPr>
+          <w:rFonts w:ascii="Helvetica" w:hAnsi="Helvetica"/>
+          <w:color w:val="auto"/>
+        </w:rPr>
+      </w:pPr>
+    </w:p>
+    <w:p>
+      <w:pPr>
+        <w:pStyle w:val="Citationintense1"/>
+        <w:ind w:left="0"/>
+        <w:rPr>
+          <w:rFonts w:ascii="Helvetica" w:hAnsi="Helvetica"/>
+          <w:color w:val="auto"/>
+        </w:rPr>
+      </w:pPr>
+      <w:r>
+        <w:rPr>
+          <w:rFonts w:ascii="Helvetica" w:hAnsi="Helvetica"/>
+          <w:color w:val="auto"/>
+        </w:rPr>
+        <w:lastRenderedPageBreak/>
+        <w:t>Décisions prises</w:t>
+      </w:r>
+      <w:r>
+        <w:rPr>
+          <w:rFonts w:ascii="Helvetica" w:hAnsi="Helvetica"/>
+          <w:sz w:val="22"/>
+        </w:rPr>
+        <w:t>.</w:t>
+      </w:r>
+    </w:p>
+    <w:p>
+      <w:pPr>
+        <w:pStyle w:val="Paragraphedeliste"/>
+        <w:numPr>
+          <w:ilvl w:val="0"/>
+          <w:numId w:val="26"/>
+        </w:numPr>
+        <w:ind w:left="426"/>
+        <w:rPr>
+          <w:rFonts w:ascii="Helvetica" w:hAnsi="Helvetica"/>
+          <w:sz w:val="22"/>
+        </w:rPr>
+      </w:pPr>
+      <w:r>
+        <w:rPr>
+          <w:rFonts w:ascii="Helvetica" w:hAnsi="Helvetica"/>
+          <w:sz w:val="22"/>
+        </w:rPr>
+        <w:t>Le bloc de bypass sera intégré directement sur les cartes filles.</w:t>
+      </w:r>
+    </w:p>
+    <w:p>
+      <w:pPr>
+        <w:pStyle w:val="Paragraphedeliste"/>
+        <w:numPr>
+          <w:ilvl w:val="0"/>
+          <w:numId w:val="26"/>
+        </w:numPr>
+        <w:ind w:left="426"/>
+        <w:rPr>
+          <w:rFonts w:ascii="Helvetica" w:hAnsi="Helvetica"/>
+          <w:sz w:val="22"/>
+        </w:rPr>
+      </w:pPr>
+      <w:r>
+        <w:rPr>
+          <w:rFonts w:ascii="Helvetica" w:hAnsi="Helvetica"/>
+          <w:sz w:val="22"/>
+        </w:rPr>
+        <w:t>L’Ethernet sera limité à 2 paires (100 Mbit/s).</w:t>
+      </w:r>
+    </w:p>
+    <w:p>
+      <w:pPr>
+        <w:pStyle w:val="Paragraphedeliste"/>
+        <w:numPr>
+          <w:ilvl w:val="0"/>
+          <w:numId w:val="26"/>
+        </w:numPr>
+        <w:ind w:left="426"/>
+        <w:rPr>
+          <w:rFonts w:ascii="Helvetica" w:hAnsi="Helvetica"/>
+          <w:sz w:val="22"/>
+        </w:rPr>
+      </w:pPr>
+      <w:r>
+        <w:rPr>
+          <w:rFonts w:ascii="Helvetica" w:hAnsi="Helvetica"/>
+          <w:sz w:val="22"/>
+        </w:rPr>
+        <w:t>L’ADC est validé comme choix principal.</w:t>
+      </w:r>
+    </w:p>
+    <w:p>
+      <w:pPr>
+        <w:pStyle w:val="Paragraphedeliste"/>
+        <w:numPr>
+          <w:ilvl w:val="0"/>
+          <w:numId w:val="26"/>
+        </w:numPr>
+        <w:ind w:left="426"/>
+        <w:rPr>
+          <w:rFonts w:ascii="Helvetica" w:hAnsi="Helvetica"/>
+          <w:sz w:val="22"/>
+        </w:rPr>
+      </w:pPr>
+      <w:r>
+        <w:rPr>
+          <w:rFonts w:ascii="Helvetica" w:hAnsi="Helvetica"/>
+          <w:sz w:val="22"/>
+        </w:rPr>
+        <w:t>L’Ethernet nécessitera une impédance contrôlée de 100 Ω.</w:t>
+      </w:r>
+    </w:p>
+    <w:p>
+      <w:pPr>
+        <w:pStyle w:val="Paragraphedeliste"/>
+        <w:numPr>
+          <w:ilvl w:val="0"/>
+          <w:numId w:val="26"/>
+        </w:numPr>
+        <w:ind w:left="426"/>
+        <w:rPr>
+          <w:rFonts w:ascii="Helvetica" w:hAnsi="Helvetica"/>
+          <w:sz w:val="22"/>
+        </w:rPr>
+      </w:pPr>
+      <w:r>
+        <w:rPr>
+          <w:rFonts w:ascii="Helvetica" w:hAnsi="Helvetica"/>
+          <w:sz w:val="22"/>
+        </w:rPr>
+        <w:t>Un shunt de consommation sera ajouté en entrée.</w:t>
+      </w:r>
+    </w:p>
+    <w:p>
+      <w:pPr>
+        <w:pStyle w:val="Paragraphedeliste"/>
+        <w:numPr>
+          <w:ilvl w:val="0"/>
+          <w:numId w:val="26"/>
+        </w:numPr>
+        <w:ind w:left="426"/>
         <w:rPr>
           <w:rFonts w:ascii="Helvetica" w:hAnsi="Helvetica"/>
           <w:i/>
         </w:rPr>
       </w:pPr>
+      <w:r>
+        <w:rPr>
+          <w:rFonts w:ascii="Helvetica" w:hAnsi="Helvetica"/>
+          <w:sz w:val="22"/>
+        </w:rPr>
+        <w:t>Le convertisseur AC/DC doit être vérifié afin de garantir qu’il puisse fournir la puissance définie.</w:t>
+      </w:r>
       <w:r>
         <w:rPr>
           <w:rFonts w:ascii="Helvetica" w:hAnsi="Helvetica"/>
@@ -432,11 +925,102 @@
           <w:rFonts w:ascii="Helvetica" w:hAnsi="Helvetica"/>
           <w:sz w:val="22"/>
         </w:rPr>
-        <w:t>F</w:t>
+        <w:t xml:space="preserve">Revue de la schématique </w:t>
+      </w:r>
+      <w:r>
+        <w:rPr>
+          <w:rFonts w:ascii="Helvetica" w:hAnsi="Helvetica"/>
+          <w:sz w:val="22"/>
+        </w:rPr>
+        <w:t>le l</w:t>
+      </w:r>
+      <w:r>
+        <w:rPr>
+          <w:rFonts w:ascii="Helvetica" w:hAnsi="Helvetica"/>
+          <w:sz w:val="22"/>
+        </w:rPr>
+        <w:t>undi 2</w:t>
+      </w:r>
+      <w:r>
+        <w:rPr>
+          <w:rFonts w:ascii="Helvetica" w:hAnsi="Helvetica"/>
+          <w:sz w:val="22"/>
+        </w:rPr>
+        <w:t>5</w:t>
+      </w:r>
+      <w:r>
+        <w:rPr>
+          <w:rFonts w:ascii="Helvetica" w:hAnsi="Helvetica"/>
+          <w:sz w:val="22"/>
+        </w:rPr>
+        <w:t>.08.2025</w:t>
       </w:r>
     </w:p>
     <w:p>
       <w:pPr>
+        <w:pStyle w:val="Paragraphedeliste1"/>
+        <w:numPr>
+          <w:ilvl w:val="0"/>
+          <w:numId w:val="8"/>
+        </w:numPr>
+        <w:ind w:left="0" w:firstLine="0"/>
+        <w:rPr>
+          <w:rFonts w:ascii="Helvetica" w:hAnsi="Helvetica"/>
+          <w:sz w:val="22"/>
+        </w:rPr>
+      </w:pPr>
+      <w:r>
+        <w:rPr>
+          <w:rFonts w:ascii="Helvetica" w:hAnsi="Helvetica"/>
+          <w:sz w:val="22"/>
+        </w:rPr>
+        <w:t xml:space="preserve">Finalisation du PCB </w:t>
+      </w:r>
+      <w:r>
+        <w:rPr>
+          <w:rFonts w:ascii="Helvetica" w:hAnsi="Helvetica"/>
+          <w:sz w:val="22"/>
+        </w:rPr>
+        <w:t xml:space="preserve">le </w:t>
+      </w:r>
+      <w:r>
+        <w:rPr>
+          <w:rFonts w:ascii="Helvetica" w:hAnsi="Helvetica"/>
+          <w:sz w:val="22"/>
+        </w:rPr>
+        <w:t>vendredi 29.08.2025</w:t>
+      </w:r>
+    </w:p>
+    <w:p>
+      <w:pPr>
+        <w:pStyle w:val="Paragraphedeliste1"/>
+        <w:numPr>
+          <w:ilvl w:val="0"/>
+          <w:numId w:val="8"/>
+        </w:numPr>
+        <w:ind w:left="0" w:firstLine="0"/>
+        <w:rPr>
+          <w:rFonts w:ascii="Helvetica" w:hAnsi="Helvetica"/>
+          <w:sz w:val="22"/>
+        </w:rPr>
+      </w:pPr>
+      <w:r>
+        <w:rPr>
+          <w:rFonts w:ascii="Helvetica" w:hAnsi="Helvetica"/>
+          <w:sz w:val="22"/>
+        </w:rPr>
+        <w:t>Revue layout le lundi 1</w:t>
+      </w:r>
+      <w:r>
+        <w:rPr>
+          <w:rFonts w:ascii="Helvetica" w:hAnsi="Helvetica"/>
+          <w:sz w:val="22"/>
+        </w:rPr>
+        <w:t>.09.2025 à 9h30</w:t>
+      </w:r>
+    </w:p>
+    <w:p>
+      <w:pPr>
         <w:pStyle w:val="Citationintense1"/>
         <w:ind w:left="0"/>
         <w:rPr>
@@ -479,14 +1063,35 @@
           <w:rFonts w:ascii="Helvetica" w:hAnsi="Helvetica"/>
           <w:sz w:val="22"/>
         </w:rPr>
-        <w:t>22.08.2025, </w:t>
-      </w:r>
-      <w:r>
-        <w:rPr>
-          <w:rFonts w:ascii="Helvetica" w:hAnsi="Helvetica"/>
-          <w:sz w:val="22"/>
-        </w:rPr>
-        <w:t>16h30</w:t>
+        <w:t>2</w:t>
+      </w:r>
+      <w:r>
+        <w:rPr>
+          <w:rFonts w:ascii="Helvetica" w:hAnsi="Helvetica"/>
+          <w:sz w:val="22"/>
+        </w:rPr>
+        <w:t>5</w:t>
+      </w:r>
+      <w:r>
+        <w:rPr>
+          <w:rFonts w:ascii="Helvetica" w:hAnsi="Helvetica"/>
+          <w:sz w:val="22"/>
+        </w:rPr>
+        <w:t>.08.2025, </w:t>
+      </w:r>
+      <w:r>
+        <w:rPr>
+          <w:rFonts w:ascii="Helvetica" w:hAnsi="Helvetica"/>
+          <w:sz w:val="22"/>
+        </w:rPr>
+        <w:t>09</w:t>
+      </w:r>
+      <w:r>
+        <w:rPr>
+          <w:rFonts w:ascii="Helvetica" w:hAnsi="Helvetica"/>
+          <w:sz w:val="22"/>
+        </w:rPr>
+        <w:t>h30</w:t>
       </w:r>
       <w:r>
         <w:rPr>
@@ -507,7 +1112,28 @@
           <w:rFonts w:ascii="Helvetica" w:hAnsi="Helvetica"/>
           <w:sz w:val="22"/>
         </w:rPr>
-        <w:t xml:space="preserve">– Suivit projets. </w:t>
+        <w:t xml:space="preserve">– </w:t>
+      </w:r>
+      <w:r>
+        <w:rPr>
+          <w:rFonts w:ascii="Helvetica" w:hAnsi="Helvetica"/>
+          <w:sz w:val="22"/>
+        </w:rPr>
+        <w:t>Rev</w:t>
+      </w:r>
+      <w:r>
+        <w:rPr>
+          <w:rFonts w:ascii="Helvetica" w:hAnsi="Helvetica"/>
+          <w:sz w:val="22"/>
+        </w:rPr>
+        <w:t>ue</w:t>
+      </w:r>
+      <w:r>
+        <w:rPr>
+          <w:rFonts w:ascii="Helvetica" w:hAnsi="Helvetica"/>
+          <w:sz w:val="22"/>
+        </w:rPr>
+        <w:t xml:space="preserve"> schémas</w:t>
       </w:r>
     </w:p>
     <w:p>
@@ -523,7 +1149,58 @@
           <w:rFonts w:ascii="Helvetica" w:hAnsi="Helvetica"/>
           <w:sz w:val="22"/>
         </w:rPr>
-        <w:t>25.08.2025</w:t>
+        <w:t xml:space="preserve">28.08.2025, 16h45, </w:t>
+      </w:r>
+      <w:r>
+        <w:rPr>
+          <w:rFonts w:ascii="Helvetica" w:hAnsi="Helvetica"/>
+          <w:sz w:val="22"/>
+        </w:rPr>
+        <w:t>Visioconférence</w:t>
+      </w:r>
+      <w:r>
+        <w:rPr>
+          <w:rFonts w:ascii="Helvetica" w:hAnsi="Helvetica"/>
+          <w:sz w:val="22"/>
+        </w:rPr>
+        <w:t xml:space="preserve"> – Réunion suivis</w:t>
+      </w:r>
+    </w:p>
+    <w:p>
+      <w:pPr>
+        <w:jc w:val="left"/>
+        <w:rPr>
+          <w:rFonts w:ascii="Helvetica" w:hAnsi="Helvetica"/>
+          <w:sz w:val="22"/>
+        </w:rPr>
+      </w:pPr>
+      <w:r>
+        <w:rPr>
+          <w:rFonts w:ascii="Helvetica" w:hAnsi="Helvetica"/>
+          <w:sz w:val="22"/>
+        </w:rPr>
+        <w:t>01</w:t>
+      </w:r>
+      <w:r>
+        <w:rPr>
+          <w:rFonts w:ascii="Helvetica" w:hAnsi="Helvetica"/>
+          <w:sz w:val="22"/>
+        </w:rPr>
+        <w:t>.0</w:t>
+      </w:r>
+      <w:r>
+        <w:rPr>
+          <w:rFonts w:ascii="Helvetica" w:hAnsi="Helvetica"/>
+          <w:sz w:val="22"/>
+        </w:rPr>
+        <w:t>9</w:t>
+      </w:r>
+      <w:r>
+        <w:rPr>
+          <w:rFonts w:ascii="Helvetica" w:hAnsi="Helvetica"/>
+          <w:sz w:val="22"/>
+        </w:rPr>
+        <w:t>.2025</w:t>
       </w:r>
       <w:r>
         <w:rPr>
@@ -537,6 +1214,13 @@
           <w:rFonts w:ascii="Helvetica" w:hAnsi="Helvetica"/>
           <w:sz w:val="22"/>
         </w:rPr>
+        <w:t>0</w:t>
+      </w:r>
+      <w:r>
+        <w:rPr>
+          <w:rFonts w:ascii="Helvetica" w:hAnsi="Helvetica"/>
+          <w:sz w:val="22"/>
+        </w:rPr>
         <w:t>9h30</w:t>
       </w:r>
       <w:r>
@@ -551,7 +1235,51 @@
           <w:rFonts w:ascii="Helvetica" w:hAnsi="Helvetica"/>
           <w:sz w:val="22"/>
         </w:rPr>
-        <w:t xml:space="preserve"> Visioconférence – Review schémas</w:t>
+        <w:t xml:space="preserve"> Visioconférence – </w:t>
+      </w:r>
+      <w:r>
+        <w:rPr>
+          <w:rFonts w:ascii="Helvetica" w:hAnsi="Helvetica"/>
+          <w:sz w:val="22"/>
+        </w:rPr>
+        <w:t>Revue</w:t>
+      </w:r>
+      <w:r>
+        <w:rPr>
+          <w:rFonts w:ascii="Helvetica" w:hAnsi="Helvetica"/>
+          <w:sz w:val="22"/>
+        </w:rPr>
+        <w:t xml:space="preserve"> </w:t>
+      </w:r>
+      <w:r>
+        <w:rPr>
+          <w:rFonts w:ascii="Helvetica" w:hAnsi="Helvetica"/>
+          <w:sz w:val="22"/>
+        </w:rPr>
+        <w:t>Layout</w:t>
+      </w:r>
+    </w:p>
+    <w:p>
+      <w:pPr>
+        <w:jc w:val="left"/>
+        <w:rPr>
+          <w:rFonts w:ascii="Helvetica" w:hAnsi="Helvetica"/>
+          <w:sz w:val="22"/>
+        </w:rPr>
+      </w:pPr>
+      <w:r>
+        <w:rPr>
+          <w:rFonts w:ascii="Helvetica" w:hAnsi="Helvetica"/>
+          <w:sz w:val="22"/>
+        </w:rPr>
+        <w:t xml:space="preserve">03.09.2025, </w:t>
+      </w:r>
+      <w:r>
+        <w:rPr>
+          <w:rFonts w:ascii="Helvetica" w:hAnsi="Helvetica"/>
+          <w:sz w:val="22"/>
+        </w:rPr>
+        <w:t xml:space="preserve">à définir, à définir – Réunion algorithme </w:t>
       </w:r>
     </w:p>
     <w:p>
@@ -677,7 +1405,6 @@
           <w:rFonts w:ascii="Helvetica" w:hAnsi="Helvetica"/>
           <w:sz w:val="22"/>
         </w:rPr>
-        <w:lastRenderedPageBreak/>
         <w:t xml:space="preserve">Lausanne le </w:t>
       </w:r>
       <w:r>
@@ -685,7 +1412,7 @@
           <w:rFonts w:ascii="Helvetica" w:hAnsi="Helvetica"/>
           <w:sz w:val="22"/>
         </w:rPr>
-        <w:t>18</w:t>
+        <w:t>25</w:t>
       </w:r>
       <w:r>
         <w:rPr>
@@ -938,7 +1665,7 @@
         <w:rFonts w:ascii="Helvetica" w:hAnsi="Helvetica"/>
         <w:sz w:val="20"/>
       </w:rPr>
-      <w:t>21.08.2025</w:t>
+      <w:t>25.08.2025</w:t>
     </w:r>
     <w:r>
       <w:rPr>
@@ -1682,6 +2409,232 @@
 <file path=word/numbering.xml><?xml version="1.0" encoding="utf-8"?>
 <w:numbering xmlns:wpc="http://schemas.microsoft.com/office/word/2010/wordprocessingCanvas" xmlns:cx="http://schemas.microsoft.com/office/drawing/2014/chartex" xmlns:cx1="http://schemas.microsoft.com/office/drawing/2015/9/8/chartex" xmlns:cx2="http://schemas.microsoft.com/office/drawing/2015/10/21/chartex" xmlns:cx3="http://schemas.microsoft.com/office/drawing/2016/5/9/chartex" xmlns:cx4="http://schemas.microsoft.com/office/drawing/2016/5/10/chartex" xmlns:cx5="http://schemas.microsoft.com/office/drawing/2016/5/11/chartex" xmlns:cx6="http://schemas.microsoft.com/office/drawing/2016/5/12/chartex" xmlns:cx7="http://schemas.microsoft.com/office/drawing/2016/5/13/chartex" xmlns:cx8="http://schemas.microsoft.com/office/drawing/2016/5/14/chartex" xmlns:mc="http://schemas.openxmlformats.org/markup-compatibility/2006" xmlns:aink="http://schemas.microsoft.com/office/drawing/2016/ink" xmlns:am3d="http://schemas.microsoft.com/office/drawing/2017/model3d" xmlns:o="urn:schemas-microsoft-com:office:office" xmlns:r="http://schemas.openxmlformats.org/officeDocument/2006/relationships" xmlns:m="http://schemas.openxmlformats.org/officeDocument/2006/math" xmlns:v="urn:schemas-microsoft-com:vml" xmlns:wp14="http://schemas.microsoft.com/office/word/2010/wordprocessingDrawing" xmlns:wp="http://schemas.openxmlformats.org/drawingml/2006/wordprocessingDrawing" xmlns:w10="urn:schemas-microsoft-com:office:word" xmlns:w="http://schemas.openxmlformats.org/wordprocessingml/2006/main" xmlns:w14="http://schemas.microsoft.com/office/word/2010/wordml" xmlns:w15="http://schemas.microsoft.com/office/word/2012/wordml" xmlns:w16cex="http://schemas.microsoft.com/office/word/2018/wordml/cex" xmlns:w16cid="http://schemas.microsoft.com/office/word/2016/wordml/cid" xmlns:w16="http://schemas.microsoft.com/office/word/2018/wordml" xmlns:w16se="http://schemas.microsoft.com/office/word/2015/wordml/symex" xmlns:wpg="http://schemas.microsoft.com/office/word/2010/wordprocessingGroup" xmlns:wpi="http://schemas.microsoft.com/office/word/2010/wordprocessingInk" xmlns:wne="http://schemas.microsoft.com/office/word/2006/wordml" xmlns:wps="http://schemas.microsoft.com/office/word/2010/wordprocessingShape" mc:Ignorable="w14 w15 w16se w16cid w16 w16cex wp14">
   <w:abstractNum w:abstractNumId="0" w15:restartNumberingAfterBreak="0">
+    <w:nsid w:val="03562D8A"/>
+    <w:multiLevelType w:val="hybridMultilevel"/>
+    <w:tmpl w:val="6202785A"/>
+    <w:lvl w:ilvl="0" w:tplc="100C0001">
+      <w:start w:val="1"/>
+      <w:numFmt w:val="bullet"/>
+      <w:lvlText w:val=""/>
+      <w:lvlJc w:val="left"/>
+      <w:pPr>
+        <w:ind w:left="720" w:hanging="360"/>
+      </w:pPr>
+      <w:rPr>
+        <w:rFonts w:ascii="Symbol" w:hAnsi="Symbol" w:hint="default"/>
+      </w:rPr>
+    </w:lvl>
+    <w:lvl w:ilvl="1" w:tplc="100C0003" w:tentative="1">
+      <w:start w:val="1"/>
+      <w:numFmt w:val="bullet"/>
+      <w:lvlText w:val="o"/>
+      <w:lvlJc w:val="left"/>
+      <w:pPr>
+        <w:ind w:left="1440" w:hanging="360"/>
+      </w:pPr>
+      <w:rPr>
+        <w:rFonts w:ascii="Courier New" w:hAnsi="Courier New" w:cs="Courier New" w:hint="default"/>
+      </w:rPr>
+    </w:lvl>
+    <w:lvl w:ilvl="2" w:tplc="100C0005" w:tentative="1">
+      <w:start w:val="1"/>
+      <w:numFmt w:val="bullet"/>
+      <w:lvlText w:val=""/>
+      <w:lvlJc w:val="left"/>
+      <w:pPr>
+        <w:ind w:left="2160" w:hanging="360"/>
+      </w:pPr>
+      <w:rPr>
+        <w:rFonts w:ascii="Wingdings" w:hAnsi="Wingdings" w:hint="default"/>
+      </w:rPr>
+    </w:lvl>
+    <w:lvl w:ilvl="3" w:tplc="100C0001" w:tentative="1">
+      <w:start w:val="1"/>
+      <w:numFmt w:val="bullet"/>
+      <w:lvlText w:val=""/>
+      <w:lvlJc w:val="left"/>
+      <w:pPr>
+        <w:ind w:left="2880" w:hanging="360"/>
+      </w:pPr>
+      <w:rPr>
+        <w:rFonts w:ascii="Symbol" w:hAnsi="Symbol" w:hint="default"/>
+      </w:rPr>
+    </w:lvl>
+    <w:lvl w:ilvl="4" w:tplc="100C0003" w:tentative="1">
+      <w:start w:val="1"/>
+      <w:numFmt w:val="bullet"/>
+      <w:lvlText w:val="o"/>
+      <w:lvlJc w:val="left"/>
+      <w:pPr>
+        <w:ind w:left="3600" w:hanging="360"/>
+      </w:pPr>
+      <w:rPr>
+        <w:rFonts w:ascii="Courier New" w:hAnsi="Courier New" w:cs="Courier New" w:hint="default"/>
+      </w:rPr>
+    </w:lvl>
+    <w:lvl w:ilvl="5" w:tplc="100C0005" w:tentative="1">
+      <w:start w:val="1"/>
+      <w:numFmt w:val="bullet"/>
+      <w:lvlText w:val=""/>
+      <w:lvlJc w:val="left"/>
+      <w:pPr>
+        <w:ind w:left="4320" w:hanging="360"/>
+      </w:pPr>
+      <w:rPr>
+        <w:rFonts w:ascii="Wingdings" w:hAnsi="Wingdings" w:hint="default"/>
+      </w:rPr>
+    </w:lvl>
+    <w:lvl w:ilvl="6" w:tplc="100C0001" w:tentative="1">
+      <w:start w:val="1"/>
+      <w:numFmt w:val="bullet"/>
+      <w:lvlText w:val=""/>
+      <w:lvlJc w:val="left"/>
+      <w:pPr>
+        <w:ind w:left="5040" w:hanging="360"/>
+      </w:pPr>
+      <w:rPr>
+        <w:rFonts w:ascii="Symbol" w:hAnsi="Symbol" w:hint="default"/>
+      </w:rPr>
+    </w:lvl>
+    <w:lvl w:ilvl="7" w:tplc="100C0003" w:tentative="1">
+      <w:start w:val="1"/>
+      <w:numFmt w:val="bullet"/>
+      <w:lvlText w:val="o"/>
+      <w:lvlJc w:val="left"/>
+      <w:pPr>
+        <w:ind w:left="5760" w:hanging="360"/>
+      </w:pPr>
+      <w:rPr>
+        <w:rFonts w:ascii="Courier New" w:hAnsi="Courier New" w:cs="Courier New" w:hint="default"/>
+      </w:rPr>
+    </w:lvl>
+    <w:lvl w:ilvl="8" w:tplc="100C0005" w:tentative="1">
+      <w:start w:val="1"/>
+      <w:numFmt w:val="bullet"/>
+      <w:lvlText w:val=""/>
+      <w:lvlJc w:val="left"/>
+      <w:pPr>
+        <w:ind w:left="6480" w:hanging="360"/>
+      </w:pPr>
+      <w:rPr>
+        <w:rFonts w:ascii="Wingdings" w:hAnsi="Wingdings" w:hint="default"/>
+      </w:rPr>
+    </w:lvl>
+  </w:abstractNum>
+  <w:abstractNum w:abstractNumId="1" w15:restartNumberingAfterBreak="0">
+    <w:nsid w:val="0A8B3577"/>
+    <w:multiLevelType w:val="hybridMultilevel"/>
+    <w:tmpl w:val="CE4A8934"/>
+    <w:lvl w:ilvl="0" w:tplc="100C0001">
+      <w:start w:val="1"/>
+      <w:numFmt w:val="bullet"/>
+      <w:lvlText w:val=""/>
+      <w:lvlJc w:val="left"/>
+      <w:pPr>
+        <w:ind w:left="720" w:hanging="360"/>
+      </w:pPr>
+      <w:rPr>
+        <w:rFonts w:ascii="Symbol" w:hAnsi="Symbol" w:hint="default"/>
+      </w:rPr>
+    </w:lvl>
+    <w:lvl w:ilvl="1" w:tplc="100C0003">
+      <w:start w:val="1"/>
+      <w:numFmt w:val="bullet"/>
+      <w:lvlText w:val="o"/>
+      <w:lvlJc w:val="left"/>
+      <w:pPr>
+        <w:ind w:left="1440" w:hanging="360"/>
+      </w:pPr>
+      <w:rPr>
+        <w:rFonts w:ascii="Courier New" w:hAnsi="Courier New" w:cs="Courier New" w:hint="default"/>
+      </w:rPr>
+    </w:lvl>
+    <w:lvl w:ilvl="2" w:tplc="100C0005" w:tentative="1">
+      <w:start w:val="1"/>
+      <w:numFmt w:val="bullet"/>
+      <w:lvlText w:val=""/>
+      <w:lvlJc w:val="left"/>
+      <w:pPr>
+        <w:ind w:left="2160" w:hanging="360"/>
+      </w:pPr>
+      <w:rPr>
+        <w:rFonts w:ascii="Wingdings" w:hAnsi="Wingdings" w:hint="default"/>
+      </w:rPr>
+    </w:lvl>
+    <w:lvl w:ilvl="3" w:tplc="100C0001" w:tentative="1">
+      <w:start w:val="1"/>
+      <w:numFmt w:val="bullet"/>
+      <w:lvlText w:val=""/>
+      <w:lvlJc w:val="left"/>
+      <w:pPr>
+        <w:ind w:left="2880" w:hanging="360"/>
+      </w:pPr>
+      <w:rPr>
+        <w:rFonts w:ascii="Symbol" w:hAnsi="Symbol" w:hint="default"/>
+      </w:rPr>
+    </w:lvl>
+    <w:lvl w:ilvl="4" w:tplc="100C0003" w:tentative="1">
+      <w:start w:val="1"/>
+      <w:numFmt w:val="bullet"/>
+      <w:lvlText w:val="o"/>
+      <w:lvlJc w:val="left"/>
+      <w:pPr>
+        <w:ind w:left="3600" w:hanging="360"/>
+      </w:pPr>
+      <w:rPr>
+        <w:rFonts w:ascii="Courier New" w:hAnsi="Courier New" w:cs="Courier New" w:hint="default"/>
+      </w:rPr>
+    </w:lvl>
+    <w:lvl w:ilvl="5" w:tplc="100C0005" w:tentative="1">
+      <w:start w:val="1"/>
+      <w:numFmt w:val="bullet"/>
+      <w:lvlText w:val=""/>
+      <w:lvlJc w:val="left"/>
+      <w:pPr>
+        <w:ind w:left="4320" w:hanging="360"/>
+      </w:pPr>
+      <w:rPr>
+        <w:rFonts w:ascii="Wingdings" w:hAnsi="Wingdings" w:hint="default"/>
+      </w:rPr>
+    </w:lvl>
+    <w:lvl w:ilvl="6" w:tplc="100C0001" w:tentative="1">
+      <w:start w:val="1"/>
+      <w:numFmt w:val="bullet"/>
+      <w:lvlText w:val=""/>
+      <w:lvlJc w:val="left"/>
+      <w:pPr>
+        <w:ind w:left="5040" w:hanging="360"/>
+      </w:pPr>
+      <w:rPr>
+        <w:rFonts w:ascii="Symbol" w:hAnsi="Symbol" w:hint="default"/>
+      </w:rPr>
+    </w:lvl>
+    <w:lvl w:ilvl="7" w:tplc="100C0003" w:tentative="1">
+      <w:start w:val="1"/>
+      <w:numFmt w:val="bullet"/>
+      <w:lvlText w:val="o"/>
+      <w:lvlJc w:val="left"/>
+      <w:pPr>
+        <w:ind w:left="5760" w:hanging="360"/>
+      </w:pPr>
+      <w:rPr>
+        <w:rFonts w:ascii="Courier New" w:hAnsi="Courier New" w:cs="Courier New" w:hint="default"/>
+      </w:rPr>
+    </w:lvl>
+    <w:lvl w:ilvl="8" w:tplc="100C0005" w:tentative="1">
+      <w:start w:val="1"/>
+      <w:numFmt w:val="bullet"/>
+      <w:lvlText w:val=""/>
+      <w:lvlJc w:val="left"/>
+      <w:pPr>
+        <w:ind w:left="6480" w:hanging="360"/>
+      </w:pPr>
+      <w:rPr>
+        <w:rFonts w:ascii="Wingdings" w:hAnsi="Wingdings" w:hint="default"/>
+      </w:rPr>
+    </w:lvl>
+  </w:abstractNum>
+  <w:abstractNum w:abstractNumId="2" w15:restartNumberingAfterBreak="0">
     <w:nsid w:val="0DFB0AF4"/>
     <w:multiLevelType w:val="hybridMultilevel"/>
     <w:tmpl w:val="BA6EAA92"/>
@@ -1767,7 +2720,274 @@
       </w:pPr>
     </w:lvl>
   </w:abstractNum>
-  <w:abstractNum w:abstractNumId="1" w15:restartNumberingAfterBreak="0">
+  <w:abstractNum w:abstractNumId="3" w15:restartNumberingAfterBreak="0">
+    <w:nsid w:val="0F596A53"/>
+    <w:multiLevelType w:val="hybridMultilevel"/>
+    <w:tmpl w:val="E586FB80"/>
+    <w:lvl w:ilvl="0" w:tplc="4A423A82">
+      <w:start w:val="1"/>
+      <w:numFmt w:val="decimal"/>
+      <w:lvlText w:val="%1."/>
+      <w:lvlJc w:val="left"/>
+      <w:pPr>
+        <w:ind w:left="1080" w:hanging="360"/>
+      </w:pPr>
+      <w:rPr>
+        <w:rFonts w:hint="default"/>
+      </w:rPr>
+    </w:lvl>
+    <w:lvl w:ilvl="1" w:tplc="100C0019" w:tentative="1">
+      <w:start w:val="1"/>
+      <w:numFmt w:val="lowerLetter"/>
+      <w:lvlText w:val="%2."/>
+      <w:lvlJc w:val="left"/>
+      <w:pPr>
+        <w:ind w:left="1800" w:hanging="360"/>
+      </w:pPr>
+    </w:lvl>
+    <w:lvl w:ilvl="2" w:tplc="100C001B" w:tentative="1">
+      <w:start w:val="1"/>
+      <w:numFmt w:val="lowerRoman"/>
+      <w:lvlText w:val="%3."/>
+      <w:lvlJc w:val="right"/>
+      <w:pPr>
+        <w:ind w:left="2520" w:hanging="180"/>
+      </w:pPr>
+    </w:lvl>
+    <w:lvl w:ilvl="3" w:tplc="100C000F" w:tentative="1">
+      <w:start w:val="1"/>
+      <w:numFmt w:val="decimal"/>
+      <w:lvlText w:val="%4."/>
+      <w:lvlJc w:val="left"/>
+      <w:pPr>
+        <w:ind w:left="3240" w:hanging="360"/>
+      </w:pPr>
+    </w:lvl>
+    <w:lvl w:ilvl="4" w:tplc="100C0019" w:tentative="1">
+      <w:start w:val="1"/>
+      <w:numFmt w:val="lowerLetter"/>
+      <w:lvlText w:val="%5."/>
+      <w:lvlJc w:val="left"/>
+      <w:pPr>
+        <w:ind w:left="3960" w:hanging="360"/>
+      </w:pPr>
+    </w:lvl>
+    <w:lvl w:ilvl="5" w:tplc="100C001B" w:tentative="1">
+      <w:start w:val="1"/>
+      <w:numFmt w:val="lowerRoman"/>
+      <w:lvlText w:val="%6."/>
+      <w:lvlJc w:val="right"/>
+      <w:pPr>
+        <w:ind w:left="4680" w:hanging="180"/>
+      </w:pPr>
+    </w:lvl>
+    <w:lvl w:ilvl="6" w:tplc="100C000F" w:tentative="1">
+      <w:start w:val="1"/>
+      <w:numFmt w:val="decimal"/>
+      <w:lvlText w:val="%7."/>
+      <w:lvlJc w:val="left"/>
+      <w:pPr>
+        <w:ind w:left="5400" w:hanging="360"/>
+      </w:pPr>
+    </w:lvl>
+    <w:lvl w:ilvl="7" w:tplc="100C0019" w:tentative="1">
+      <w:start w:val="1"/>
+      <w:numFmt w:val="lowerLetter"/>
+      <w:lvlText w:val="%8."/>
+      <w:lvlJc w:val="left"/>
+      <w:pPr>
+        <w:ind w:left="6120" w:hanging="360"/>
+      </w:pPr>
+    </w:lvl>
+    <w:lvl w:ilvl="8" w:tplc="100C001B" w:tentative="1">
+      <w:start w:val="1"/>
+      <w:numFmt w:val="lowerRoman"/>
+      <w:lvlText w:val="%9."/>
+      <w:lvlJc w:val="right"/>
+      <w:pPr>
+        <w:ind w:left="6840" w:hanging="180"/>
+      </w:pPr>
+    </w:lvl>
+  </w:abstractNum>
+  <w:abstractNum w:abstractNumId="4" w15:restartNumberingAfterBreak="0">
+    <w:nsid w:val="10D57608"/>
+    <w:multiLevelType w:val="hybridMultilevel"/>
+    <w:tmpl w:val="9B92C61A"/>
+    <w:lvl w:ilvl="0" w:tplc="E2B252C4">
+      <w:start w:val="1"/>
+      <w:numFmt w:val="decimal"/>
+      <w:lvlText w:val="%1."/>
+      <w:lvlJc w:val="left"/>
+      <w:pPr>
+        <w:ind w:left="644" w:hanging="360"/>
+      </w:pPr>
+      <w:rPr>
+        <w:rFonts w:hint="default"/>
+      </w:rPr>
+    </w:lvl>
+    <w:lvl w:ilvl="1" w:tplc="100C0019" w:tentative="1">
+      <w:start w:val="1"/>
+      <w:numFmt w:val="lowerLetter"/>
+      <w:lvlText w:val="%2."/>
+      <w:lvlJc w:val="left"/>
+      <w:pPr>
+        <w:ind w:left="1364" w:hanging="360"/>
+      </w:pPr>
+    </w:lvl>
+    <w:lvl w:ilvl="2" w:tplc="100C001B" w:tentative="1">
+      <w:start w:val="1"/>
+      <w:numFmt w:val="lowerRoman"/>
+      <w:lvlText w:val="%3."/>
+      <w:lvlJc w:val="right"/>
+      <w:pPr>
+        <w:ind w:left="2084" w:hanging="180"/>
+      </w:pPr>
+    </w:lvl>
+    <w:lvl w:ilvl="3" w:tplc="100C000F" w:tentative="1">
+      <w:start w:val="1"/>
+      <w:numFmt w:val="decimal"/>
+      <w:lvlText w:val="%4."/>
+      <w:lvlJc w:val="left"/>
+      <w:pPr>
+        <w:ind w:left="2804" w:hanging="360"/>
+      </w:pPr>
+    </w:lvl>
+    <w:lvl w:ilvl="4" w:tplc="100C0019" w:tentative="1">
+      <w:start w:val="1"/>
+      <w:numFmt w:val="lowerLetter"/>
+      <w:lvlText w:val="%5."/>
+      <w:lvlJc w:val="left"/>
+      <w:pPr>
+        <w:ind w:left="3524" w:hanging="360"/>
+      </w:pPr>
+    </w:lvl>
+    <w:lvl w:ilvl="5" w:tplc="100C001B" w:tentative="1">
+      <w:start w:val="1"/>
+      <w:numFmt w:val="lowerRoman"/>
+      <w:lvlText w:val="%6."/>
+      <w:lvlJc w:val="right"/>
+      <w:pPr>
+        <w:ind w:left="4244" w:hanging="180"/>
+      </w:pPr>
+    </w:lvl>
+    <w:lvl w:ilvl="6" w:tplc="100C000F" w:tentative="1">
+      <w:start w:val="1"/>
+      <w:numFmt w:val="decimal"/>
+      <w:lvlText w:val="%7."/>
+      <w:lvlJc w:val="left"/>
+      <w:pPr>
+        <w:ind w:left="4964" w:hanging="360"/>
+      </w:pPr>
+    </w:lvl>
+    <w:lvl w:ilvl="7" w:tplc="100C0019" w:tentative="1">
+      <w:start w:val="1"/>
+      <w:numFmt w:val="lowerLetter"/>
+      <w:lvlText w:val="%8."/>
+      <w:lvlJc w:val="left"/>
+      <w:pPr>
+        <w:ind w:left="5684" w:hanging="360"/>
+      </w:pPr>
+    </w:lvl>
+    <w:lvl w:ilvl="8" w:tplc="100C001B" w:tentative="1">
+      <w:start w:val="1"/>
+      <w:numFmt w:val="lowerRoman"/>
+      <w:lvlText w:val="%9."/>
+      <w:lvlJc w:val="right"/>
+      <w:pPr>
+        <w:ind w:left="6404" w:hanging="180"/>
+      </w:pPr>
+    </w:lvl>
+  </w:abstractNum>
+  <w:abstractNum w:abstractNumId="5" w15:restartNumberingAfterBreak="0">
+    <w:nsid w:val="18344229"/>
+    <w:multiLevelType w:val="hybridMultilevel"/>
+    <w:tmpl w:val="4480435A"/>
+    <w:lvl w:ilvl="0" w:tplc="C8C24096">
+      <w:start w:val="1"/>
+      <w:numFmt w:val="decimal"/>
+      <w:lvlText w:val="%1."/>
+      <w:lvlJc w:val="left"/>
+      <w:pPr>
+        <w:ind w:left="644" w:hanging="360"/>
+      </w:pPr>
+      <w:rPr>
+        <w:rFonts w:hint="default"/>
+      </w:rPr>
+    </w:lvl>
+    <w:lvl w:ilvl="1" w:tplc="100C0019" w:tentative="1">
+      <w:start w:val="1"/>
+      <w:numFmt w:val="lowerLetter"/>
+      <w:lvlText w:val="%2."/>
+      <w:lvlJc w:val="left"/>
+      <w:pPr>
+        <w:ind w:left="1364" w:hanging="360"/>
+      </w:pPr>
+    </w:lvl>
+    <w:lvl w:ilvl="2" w:tplc="100C001B" w:tentative="1">
+      <w:start w:val="1"/>
+      <w:numFmt w:val="lowerRoman"/>
+      <w:lvlText w:val="%3."/>
+      <w:lvlJc w:val="right"/>
+      <w:pPr>
+        <w:ind w:left="2084" w:hanging="180"/>
+      </w:pPr>
+    </w:lvl>
+    <w:lvl w:ilvl="3" w:tplc="100C000F" w:tentative="1">
+      <w:start w:val="1"/>
+      <w:numFmt w:val="decimal"/>
+      <w:lvlText w:val="%4."/>
+      <w:lvlJc w:val="left"/>
+      <w:pPr>
+        <w:ind w:left="2804" w:hanging="360"/>
+      </w:pPr>
+    </w:lvl>
+    <w:lvl w:ilvl="4" w:tplc="100C0019" w:tentative="1">
+      <w:start w:val="1"/>
+      <w:numFmt w:val="lowerLetter"/>
+      <w:lvlText w:val="%5."/>
+      <w:lvlJc w:val="left"/>
+      <w:pPr>
+        <w:ind w:left="3524" w:hanging="360"/>
+      </w:pPr>
+    </w:lvl>
+    <w:lvl w:ilvl="5" w:tplc="100C001B" w:tentative="1">
+      <w:start w:val="1"/>
+      <w:numFmt w:val="lowerRoman"/>
+      <w:lvlText w:val="%6."/>
+      <w:lvlJc w:val="right"/>
+      <w:pPr>
+        <w:ind w:left="4244" w:hanging="180"/>
+      </w:pPr>
+    </w:lvl>
+    <w:lvl w:ilvl="6" w:tplc="100C000F" w:tentative="1">
+      <w:start w:val="1"/>
+      <w:numFmt w:val="decimal"/>
+      <w:lvlText w:val="%7."/>
+      <w:lvlJc w:val="left"/>
+      <w:pPr>
+        <w:ind w:left="4964" w:hanging="360"/>
+      </w:pPr>
+    </w:lvl>
+    <w:lvl w:ilvl="7" w:tplc="100C0019" w:tentative="1">
+      <w:start w:val="1"/>
+      <w:numFmt w:val="lowerLetter"/>
+      <w:lvlText w:val="%8."/>
+      <w:lvlJc w:val="left"/>
+      <w:pPr>
+        <w:ind w:left="5684" w:hanging="360"/>
+      </w:pPr>
+    </w:lvl>
+    <w:lvl w:ilvl="8" w:tplc="100C001B" w:tentative="1">
+      <w:start w:val="1"/>
+      <w:numFmt w:val="lowerRoman"/>
+      <w:lvlText w:val="%9."/>
+      <w:lvlJc w:val="right"/>
+      <w:pPr>
+        <w:ind w:left="6404" w:hanging="180"/>
+      </w:pPr>
+    </w:lvl>
+  </w:abstractNum>
+  <w:abstractNum w:abstractNumId="6" w15:restartNumberingAfterBreak="0">
     <w:nsid w:val="1AE74DBC"/>
     <w:multiLevelType w:val="hybridMultilevel"/>
     <w:tmpl w:val="AF6EB48A"/>
@@ -1880,7 +3100,7 @@
       </w:rPr>
     </w:lvl>
   </w:abstractNum>
-  <w:abstractNum w:abstractNumId="2" w15:restartNumberingAfterBreak="0">
+  <w:abstractNum w:abstractNumId="7" w15:restartNumberingAfterBreak="0">
     <w:nsid w:val="28A61C7A"/>
     <w:multiLevelType w:val="hybridMultilevel"/>
     <w:tmpl w:val="68AE6D44"/>
@@ -1993,7 +3213,120 @@
       </w:rPr>
     </w:lvl>
   </w:abstractNum>
-  <w:abstractNum w:abstractNumId="3" w15:restartNumberingAfterBreak="0">
+  <w:abstractNum w:abstractNumId="8" w15:restartNumberingAfterBreak="0">
+    <w:nsid w:val="3E4C2A41"/>
+    <w:multiLevelType w:val="hybridMultilevel"/>
+    <w:tmpl w:val="9A040DCC"/>
+    <w:lvl w:ilvl="0" w:tplc="100C0001">
+      <w:start w:val="1"/>
+      <w:numFmt w:val="bullet"/>
+      <w:lvlText w:val=""/>
+      <w:lvlJc w:val="left"/>
+      <w:pPr>
+        <w:ind w:left="1800" w:hanging="360"/>
+      </w:pPr>
+      <w:rPr>
+        <w:rFonts w:ascii="Symbol" w:hAnsi="Symbol" w:hint="default"/>
+      </w:rPr>
+    </w:lvl>
+    <w:lvl w:ilvl="1" w:tplc="100C0003" w:tentative="1">
+      <w:start w:val="1"/>
+      <w:numFmt w:val="bullet"/>
+      <w:lvlText w:val="o"/>
+      <w:lvlJc w:val="left"/>
+      <w:pPr>
+        <w:ind w:left="2520" w:hanging="360"/>
+      </w:pPr>
+      <w:rPr>
+        <w:rFonts w:ascii="Courier New" w:hAnsi="Courier New" w:cs="Courier New" w:hint="default"/>
+      </w:rPr>
+    </w:lvl>
+    <w:lvl w:ilvl="2" w:tplc="100C0005" w:tentative="1">
+      <w:start w:val="1"/>
+      <w:numFmt w:val="bullet"/>
+      <w:lvlText w:val=""/>
+      <w:lvlJc w:val="left"/>
+      <w:pPr>
+        <w:ind w:left="3240" w:hanging="360"/>
+      </w:pPr>
+      <w:rPr>
+        <w:rFonts w:ascii="Wingdings" w:hAnsi="Wingdings" w:hint="default"/>
+      </w:rPr>
+    </w:lvl>
+    <w:lvl w:ilvl="3" w:tplc="100C0001" w:tentative="1">
+      <w:start w:val="1"/>
+      <w:numFmt w:val="bullet"/>
+      <w:lvlText w:val=""/>
+      <w:lvlJc w:val="left"/>
+      <w:pPr>
+        <w:ind w:left="3960" w:hanging="360"/>
+      </w:pPr>
+      <w:rPr>
+        <w:rFonts w:ascii="Symbol" w:hAnsi="Symbol" w:hint="default"/>
+      </w:rPr>
+    </w:lvl>
+    <w:lvl w:ilvl="4" w:tplc="100C0003" w:tentative="1">
+      <w:start w:val="1"/>
+      <w:numFmt w:val="bullet"/>
+      <w:lvlText w:val="o"/>
+      <w:lvlJc w:val="left"/>
+      <w:pPr>
+        <w:ind w:left="4680" w:hanging="360"/>
+      </w:pPr>
+      <w:rPr>
+        <w:rFonts w:ascii="Courier New" w:hAnsi="Courier New" w:cs="Courier New" w:hint="default"/>
+      </w:rPr>
+    </w:lvl>
+    <w:lvl w:ilvl="5" w:tplc="100C0005" w:tentative="1">
+      <w:start w:val="1"/>
+      <w:numFmt w:val="bullet"/>
+      <w:lvlText w:val=""/>
+      <w:lvlJc w:val="left"/>
+      <w:pPr>
+        <w:ind w:left="5400" w:hanging="360"/>
+      </w:pPr>
+      <w:rPr>
+        <w:rFonts w:ascii="Wingdings" w:hAnsi="Wingdings" w:hint="default"/>
+      </w:rPr>
+    </w:lvl>
+    <w:lvl w:ilvl="6" w:tplc="100C0001" w:tentative="1">
+      <w:start w:val="1"/>
+      <w:numFmt w:val="bullet"/>
+      <w:lvlText w:val=""/>
+      <w:lvlJc w:val="left"/>
+      <w:pPr>
+        <w:ind w:left="6120" w:hanging="360"/>
+      </w:pPr>
+      <w:rPr>
+        <w:rFonts w:ascii="Symbol" w:hAnsi="Symbol" w:hint="default"/>
+      </w:rPr>
+    </w:lvl>
+    <w:lvl w:ilvl="7" w:tplc="100C0003" w:tentative="1">
+      <w:start w:val="1"/>
+      <w:numFmt w:val="bullet"/>
+      <w:lvlText w:val="o"/>
+      <w:lvlJc w:val="left"/>
+      <w:pPr>
+        <w:ind w:left="6840" w:hanging="360"/>
+      </w:pPr>
+      <w:rPr>
+        <w:rFonts w:ascii="Courier New" w:hAnsi="Courier New" w:cs="Courier New" w:hint="default"/>
+      </w:rPr>
+    </w:lvl>
+    <w:lvl w:ilvl="8" w:tplc="100C0005" w:tentative="1">
+      <w:start w:val="1"/>
+      <w:numFmt w:val="bullet"/>
+      <w:lvlText w:val=""/>
+      <w:lvlJc w:val="left"/>
+      <w:pPr>
+        <w:ind w:left="7560" w:hanging="360"/>
+      </w:pPr>
+      <w:rPr>
+        <w:rFonts w:ascii="Wingdings" w:hAnsi="Wingdings" w:hint="default"/>
+      </w:rPr>
+    </w:lvl>
+  </w:abstractNum>
+  <w:abstractNum w:abstractNumId="9" w15:restartNumberingAfterBreak="0">
     <w:nsid w:val="3FC82AFD"/>
     <w:multiLevelType w:val="multilevel"/>
     <w:tmpl w:val="A432A0C8"/>
@@ -2127,7 +3460,7 @@
       </w:rPr>
     </w:lvl>
   </w:abstractNum>
-  <w:abstractNum w:abstractNumId="4" w15:restartNumberingAfterBreak="0">
+  <w:abstractNum w:abstractNumId="10" w15:restartNumberingAfterBreak="0">
     <w:nsid w:val="413E18AC"/>
     <w:multiLevelType w:val="hybridMultilevel"/>
     <w:tmpl w:val="51545498"/>
@@ -2240,7 +3573,7 @@
       </w:rPr>
     </w:lvl>
   </w:abstractNum>
-  <w:abstractNum w:abstractNumId="5" w15:restartNumberingAfterBreak="0">
+  <w:abstractNum w:abstractNumId="11" w15:restartNumberingAfterBreak="0">
     <w:nsid w:val="43764A4C"/>
     <w:multiLevelType w:val="hybridMultilevel"/>
     <w:tmpl w:val="137E1594"/>
@@ -2353,7 +3686,96 @@
       </w:rPr>
     </w:lvl>
   </w:abstractNum>
-  <w:abstractNum w:abstractNumId="6" w15:restartNumberingAfterBreak="0">
+  <w:abstractNum w:abstractNumId="12" w15:restartNumberingAfterBreak="0">
+    <w:nsid w:val="457A2CA7"/>
+    <w:multiLevelType w:val="hybridMultilevel"/>
+    <w:tmpl w:val="C2000D04"/>
+    <w:lvl w:ilvl="0" w:tplc="3F309BC0">
+      <w:start w:val="1"/>
+      <w:numFmt w:val="decimal"/>
+      <w:lvlText w:val="%1."/>
+      <w:lvlJc w:val="left"/>
+      <w:pPr>
+        <w:ind w:left="644" w:hanging="360"/>
+      </w:pPr>
+      <w:rPr>
+        <w:rFonts w:hint="default"/>
+      </w:rPr>
+    </w:lvl>
+    <w:lvl w:ilvl="1" w:tplc="100C0019" w:tentative="1">
+      <w:start w:val="1"/>
+      <w:numFmt w:val="lowerLetter"/>
+      <w:lvlText w:val="%2."/>
+      <w:lvlJc w:val="left"/>
+      <w:pPr>
+        <w:ind w:left="1364" w:hanging="360"/>
+      </w:pPr>
+    </w:lvl>
+    <w:lvl w:ilvl="2" w:tplc="100C001B" w:tentative="1">
+      <w:start w:val="1"/>
+      <w:numFmt w:val="lowerRoman"/>
+      <w:lvlText w:val="%3."/>
+      <w:lvlJc w:val="right"/>
+      <w:pPr>
+        <w:ind w:left="2084" w:hanging="180"/>
+      </w:pPr>
+    </w:lvl>
+    <w:lvl w:ilvl="3" w:tplc="100C000F" w:tentative="1">
+      <w:start w:val="1"/>
+      <w:numFmt w:val="decimal"/>
+      <w:lvlText w:val="%4."/>
+      <w:lvlJc w:val="left"/>
+      <w:pPr>
+        <w:ind w:left="2804" w:hanging="360"/>
+      </w:pPr>
+    </w:lvl>
+    <w:lvl w:ilvl="4" w:tplc="100C0019" w:tentative="1">
+      <w:start w:val="1"/>
+      <w:numFmt w:val="lowerLetter"/>
+      <w:lvlText w:val="%5."/>
+      <w:lvlJc w:val="left"/>
+      <w:pPr>
+        <w:ind w:left="3524" w:hanging="360"/>
+      </w:pPr>
+    </w:lvl>
+    <w:lvl w:ilvl="5" w:tplc="100C001B" w:tentative="1">
+      <w:start w:val="1"/>
+      <w:numFmt w:val="lowerRoman"/>
+      <w:lvlText w:val="%6."/>
+      <w:lvlJc w:val="right"/>
+      <w:pPr>
+        <w:ind w:left="4244" w:hanging="180"/>
+      </w:pPr>
+    </w:lvl>
+    <w:lvl w:ilvl="6" w:tplc="100C000F" w:tentative="1">
+      <w:start w:val="1"/>
+      <w:numFmt w:val="decimal"/>
+      <w:lvlText w:val="%7."/>
+      <w:lvlJc w:val="left"/>
+      <w:pPr>
+        <w:ind w:left="4964" w:hanging="360"/>
+      </w:pPr>
+    </w:lvl>
+    <w:lvl w:ilvl="7" w:tplc="100C0019" w:tentative="1">
+      <w:start w:val="1"/>
+      <w:numFmt w:val="lowerLetter"/>
+      <w:lvlText w:val="%8."/>
+      <w:lvlJc w:val="left"/>
+      <w:pPr>
+        <w:ind w:left="5684" w:hanging="360"/>
+      </w:pPr>
+    </w:lvl>
+    <w:lvl w:ilvl="8" w:tplc="100C001B" w:tentative="1">
+      <w:start w:val="1"/>
+      <w:numFmt w:val="lowerRoman"/>
+      <w:lvlText w:val="%9."/>
+      <w:lvlJc w:val="right"/>
+      <w:pPr>
+        <w:ind w:left="6404" w:hanging="180"/>
+      </w:pPr>
+    </w:lvl>
+  </w:abstractNum>
+  <w:abstractNum w:abstractNumId="13" w15:restartNumberingAfterBreak="0">
     <w:nsid w:val="49BA2364"/>
     <w:multiLevelType w:val="hybridMultilevel"/>
     <w:tmpl w:val="E1DA1A88"/>
@@ -2466,7 +3888,319 @@
       </w:rPr>
     </w:lvl>
   </w:abstractNum>
-  <w:abstractNum w:abstractNumId="7" w15:restartNumberingAfterBreak="0">
+  <w:abstractNum w:abstractNumId="14" w15:restartNumberingAfterBreak="0">
+    <w:nsid w:val="4E4854E6"/>
+    <w:multiLevelType w:val="hybridMultilevel"/>
+    <w:tmpl w:val="757205B4"/>
+    <w:lvl w:ilvl="0" w:tplc="100C0001">
+      <w:start w:val="1"/>
+      <w:numFmt w:val="bullet"/>
+      <w:lvlText w:val=""/>
+      <w:lvlJc w:val="left"/>
+      <w:pPr>
+        <w:ind w:left="720" w:hanging="360"/>
+      </w:pPr>
+      <w:rPr>
+        <w:rFonts w:ascii="Symbol" w:hAnsi="Symbol" w:hint="default"/>
+      </w:rPr>
+    </w:lvl>
+    <w:lvl w:ilvl="1" w:tplc="23CA81BC">
+      <w:start w:val="6"/>
+      <w:numFmt w:val="bullet"/>
+      <w:lvlText w:val="•"/>
+      <w:lvlJc w:val="left"/>
+      <w:pPr>
+        <w:ind w:left="1440" w:hanging="360"/>
+      </w:pPr>
+      <w:rPr>
+        <w:rFonts w:ascii="Helvetica" w:eastAsia="Times New Roman" w:hAnsi="Helvetica" w:cs="Helvetica" w:hint="default"/>
+      </w:rPr>
+    </w:lvl>
+    <w:lvl w:ilvl="2" w:tplc="100C0005" w:tentative="1">
+      <w:start w:val="1"/>
+      <w:numFmt w:val="bullet"/>
+      <w:lvlText w:val=""/>
+      <w:lvlJc w:val="left"/>
+      <w:pPr>
+        <w:ind w:left="2160" w:hanging="360"/>
+      </w:pPr>
+      <w:rPr>
+        <w:rFonts w:ascii="Wingdings" w:hAnsi="Wingdings" w:hint="default"/>
+      </w:rPr>
+    </w:lvl>
+    <w:lvl w:ilvl="3" w:tplc="100C0001" w:tentative="1">
+      <w:start w:val="1"/>
+      <w:numFmt w:val="bullet"/>
+      <w:lvlText w:val=""/>
+      <w:lvlJc w:val="left"/>
+      <w:pPr>
+        <w:ind w:left="2880" w:hanging="360"/>
+      </w:pPr>
+      <w:rPr>
+        <w:rFonts w:ascii="Symbol" w:hAnsi="Symbol" w:hint="default"/>
+      </w:rPr>
+    </w:lvl>
+    <w:lvl w:ilvl="4" w:tplc="100C0003" w:tentative="1">
+      <w:start w:val="1"/>
+      <w:numFmt w:val="bullet"/>
+      <w:lvlText w:val="o"/>
+      <w:lvlJc w:val="left"/>
+      <w:pPr>
+        <w:ind w:left="3600" w:hanging="360"/>
+      </w:pPr>
+      <w:rPr>
+        <w:rFonts w:ascii="Courier New" w:hAnsi="Courier New" w:cs="Courier New" w:hint="default"/>
+      </w:rPr>
+    </w:lvl>
+    <w:lvl w:ilvl="5" w:tplc="100C0005" w:tentative="1">
+      <w:start w:val="1"/>
+      <w:numFmt w:val="bullet"/>
+      <w:lvlText w:val=""/>
+      <w:lvlJc w:val="left"/>
+      <w:pPr>
+        <w:ind w:left="4320" w:hanging="360"/>
+      </w:pPr>
+      <w:rPr>
+        <w:rFonts w:ascii="Wingdings" w:hAnsi="Wingdings" w:hint="default"/>
+      </w:rPr>
+    </w:lvl>
+    <w:lvl w:ilvl="6" w:tplc="100C0001" w:tentative="1">
+      <w:start w:val="1"/>
+      <w:numFmt w:val="bullet"/>
+      <w:lvlText w:val=""/>
+      <w:lvlJc w:val="left"/>
+      <w:pPr>
+        <w:ind w:left="5040" w:hanging="360"/>
+      </w:pPr>
+      <w:rPr>
+        <w:rFonts w:ascii="Symbol" w:hAnsi="Symbol" w:hint="default"/>
+      </w:rPr>
+    </w:lvl>
+    <w:lvl w:ilvl="7" w:tplc="100C0003" w:tentative="1">
+      <w:start w:val="1"/>
+      <w:numFmt w:val="bullet"/>
+      <w:lvlText w:val="o"/>
+      <w:lvlJc w:val="left"/>
+      <w:pPr>
+        <w:ind w:left="5760" w:hanging="360"/>
+      </w:pPr>
+      <w:rPr>
+        <w:rFonts w:ascii="Courier New" w:hAnsi="Courier New" w:cs="Courier New" w:hint="default"/>
+      </w:rPr>
+    </w:lvl>
+    <w:lvl w:ilvl="8" w:tplc="100C0005" w:tentative="1">
+      <w:start w:val="1"/>
+      <w:numFmt w:val="bullet"/>
+      <w:lvlText w:val=""/>
+      <w:lvlJc w:val="left"/>
+      <w:pPr>
+        <w:ind w:left="6480" w:hanging="360"/>
+      </w:pPr>
+      <w:rPr>
+        <w:rFonts w:ascii="Wingdings" w:hAnsi="Wingdings" w:hint="default"/>
+      </w:rPr>
+    </w:lvl>
+  </w:abstractNum>
+  <w:abstractNum w:abstractNumId="15" w15:restartNumberingAfterBreak="0">
+    <w:nsid w:val="55AB4330"/>
+    <w:multiLevelType w:val="hybridMultilevel"/>
+    <w:tmpl w:val="B344B592"/>
+    <w:lvl w:ilvl="0" w:tplc="100C0001">
+      <w:start w:val="1"/>
+      <w:numFmt w:val="bullet"/>
+      <w:lvlText w:val=""/>
+      <w:lvlJc w:val="left"/>
+      <w:pPr>
+        <w:ind w:left="720" w:hanging="360"/>
+      </w:pPr>
+      <w:rPr>
+        <w:rFonts w:ascii="Symbol" w:hAnsi="Symbol" w:hint="default"/>
+      </w:rPr>
+    </w:lvl>
+    <w:lvl w:ilvl="1" w:tplc="100C0003">
+      <w:start w:val="1"/>
+      <w:numFmt w:val="bullet"/>
+      <w:lvlText w:val="o"/>
+      <w:lvlJc w:val="left"/>
+      <w:pPr>
+        <w:ind w:left="1440" w:hanging="360"/>
+      </w:pPr>
+      <w:rPr>
+        <w:rFonts w:ascii="Courier New" w:hAnsi="Courier New" w:cs="Courier New" w:hint="default"/>
+      </w:rPr>
+    </w:lvl>
+    <w:lvl w:ilvl="2" w:tplc="100C0005" w:tentative="1">
+      <w:start w:val="1"/>
+      <w:numFmt w:val="bullet"/>
+      <w:lvlText w:val=""/>
+      <w:lvlJc w:val="left"/>
+      <w:pPr>
+        <w:ind w:left="2160" w:hanging="360"/>
+      </w:pPr>
+      <w:rPr>
+        <w:rFonts w:ascii="Wingdings" w:hAnsi="Wingdings" w:hint="default"/>
+      </w:rPr>
+    </w:lvl>
+    <w:lvl w:ilvl="3" w:tplc="100C0001" w:tentative="1">
+      <w:start w:val="1"/>
+      <w:numFmt w:val="bullet"/>
+      <w:lvlText w:val=""/>
+      <w:lvlJc w:val="left"/>
+      <w:pPr>
+        <w:ind w:left="2880" w:hanging="360"/>
+      </w:pPr>
+      <w:rPr>
+        <w:rFonts w:ascii="Symbol" w:hAnsi="Symbol" w:hint="default"/>
+      </w:rPr>
+    </w:lvl>
+    <w:lvl w:ilvl="4" w:tplc="100C0003" w:tentative="1">
+      <w:start w:val="1"/>
+      <w:numFmt w:val="bullet"/>
+      <w:lvlText w:val="o"/>
+      <w:lvlJc w:val="left"/>
+      <w:pPr>
+        <w:ind w:left="3600" w:hanging="360"/>
+      </w:pPr>
+      <w:rPr>
+        <w:rFonts w:ascii="Courier New" w:hAnsi="Courier New" w:cs="Courier New" w:hint="default"/>
+      </w:rPr>
+    </w:lvl>
+    <w:lvl w:ilvl="5" w:tplc="100C0005" w:tentative="1">
+      <w:start w:val="1"/>
+      <w:numFmt w:val="bullet"/>
+      <w:lvlText w:val=""/>
+      <w:lvlJc w:val="left"/>
+      <w:pPr>
+        <w:ind w:left="4320" w:hanging="360"/>
+      </w:pPr>
+      <w:rPr>
+        <w:rFonts w:ascii="Wingdings" w:hAnsi="Wingdings" w:hint="default"/>
+      </w:rPr>
+    </w:lvl>
+    <w:lvl w:ilvl="6" w:tplc="100C0001" w:tentative="1">
+      <w:start w:val="1"/>
+      <w:numFmt w:val="bullet"/>
+      <w:lvlText w:val=""/>
+      <w:lvlJc w:val="left"/>
+      <w:pPr>
+        <w:ind w:left="5040" w:hanging="360"/>
+      </w:pPr>
+      <w:rPr>
+        <w:rFonts w:ascii="Symbol" w:hAnsi="Symbol" w:hint="default"/>
+      </w:rPr>
+    </w:lvl>
+    <w:lvl w:ilvl="7" w:tplc="100C0003" w:tentative="1">
+      <w:start w:val="1"/>
+      <w:numFmt w:val="bullet"/>
+      <w:lvlText w:val="o"/>
+      <w:lvlJc w:val="left"/>
+      <w:pPr>
+        <w:ind w:left="5760" w:hanging="360"/>
+      </w:pPr>
+      <w:rPr>
+        <w:rFonts w:ascii="Courier New" w:hAnsi="Courier New" w:cs="Courier New" w:hint="default"/>
+      </w:rPr>
+    </w:lvl>
+    <w:lvl w:ilvl="8" w:tplc="100C0005" w:tentative="1">
+      <w:start w:val="1"/>
+      <w:numFmt w:val="bullet"/>
+      <w:lvlText w:val=""/>
+      <w:lvlJc w:val="left"/>
+      <w:pPr>
+        <w:ind w:left="6480" w:hanging="360"/>
+      </w:pPr>
+      <w:rPr>
+        <w:rFonts w:ascii="Wingdings" w:hAnsi="Wingdings" w:hint="default"/>
+      </w:rPr>
+    </w:lvl>
+  </w:abstractNum>
+  <w:abstractNum w:abstractNumId="16" w15:restartNumberingAfterBreak="0">
+    <w:nsid w:val="5B103A36"/>
+    <w:multiLevelType w:val="hybridMultilevel"/>
+    <w:tmpl w:val="BBFEB866"/>
+    <w:lvl w:ilvl="0" w:tplc="100C000F">
+      <w:start w:val="1"/>
+      <w:numFmt w:val="decimal"/>
+      <w:lvlText w:val="%1."/>
+      <w:lvlJc w:val="left"/>
+      <w:pPr>
+        <w:ind w:left="1440" w:hanging="360"/>
+      </w:pPr>
+    </w:lvl>
+    <w:lvl w:ilvl="1" w:tplc="100C0019" w:tentative="1">
+      <w:start w:val="1"/>
+      <w:numFmt w:val="lowerLetter"/>
+      <w:lvlText w:val="%2."/>
+      <w:lvlJc w:val="left"/>
+      <w:pPr>
+        <w:ind w:left="2160" w:hanging="360"/>
+      </w:pPr>
+    </w:lvl>
+    <w:lvl w:ilvl="2" w:tplc="100C001B" w:tentative="1">
+      <w:start w:val="1"/>
+      <w:numFmt w:val="lowerRoman"/>
+      <w:lvlText w:val="%3."/>
+      <w:lvlJc w:val="right"/>
+      <w:pPr>
+        <w:ind w:left="2880" w:hanging="180"/>
+      </w:pPr>
+    </w:lvl>
+    <w:lvl w:ilvl="3" w:tplc="100C000F" w:tentative="1">
+      <w:start w:val="1"/>
+      <w:numFmt w:val="decimal"/>
+      <w:lvlText w:val="%4."/>
+      <w:lvlJc w:val="left"/>
+      <w:pPr>
+        <w:ind w:left="3600" w:hanging="360"/>
+      </w:pPr>
+    </w:lvl>
+    <w:lvl w:ilvl="4" w:tplc="100C0019" w:tentative="1">
+      <w:start w:val="1"/>
+      <w:numFmt w:val="lowerLetter"/>
+      <w:lvlText w:val="%5."/>
+      <w:lvlJc w:val="left"/>
+      <w:pPr>
+        <w:ind w:left="4320" w:hanging="360"/>
+      </w:pPr>
+    </w:lvl>
+    <w:lvl w:ilvl="5" w:tplc="100C001B" w:tentative="1">
+      <w:start w:val="1"/>
+      <w:numFmt w:val="lowerRoman"/>
+      <w:lvlText w:val="%6."/>
+      <w:lvlJc w:val="right"/>
+      <w:pPr>
+        <w:ind w:left="5040" w:hanging="180"/>
+      </w:pPr>
+    </w:lvl>
+    <w:lvl w:ilvl="6" w:tplc="100C000F" w:tentative="1">
+      <w:start w:val="1"/>
+      <w:numFmt w:val="decimal"/>
+      <w:lvlText w:val="%7."/>
+      <w:lvlJc w:val="left"/>
+      <w:pPr>
+        <w:ind w:left="5760" w:hanging="360"/>
+      </w:pPr>
+    </w:lvl>
+    <w:lvl w:ilvl="7" w:tplc="100C0019" w:tentative="1">
+      <w:start w:val="1"/>
+      <w:numFmt w:val="lowerLetter"/>
+      <w:lvlText w:val="%8."/>
+      <w:lvlJc w:val="left"/>
+      <w:pPr>
+        <w:ind w:left="6480" w:hanging="360"/>
+      </w:pPr>
+    </w:lvl>
+    <w:lvl w:ilvl="8" w:tplc="100C001B" w:tentative="1">
+      <w:start w:val="1"/>
+      <w:numFmt w:val="lowerRoman"/>
+      <w:lvlText w:val="%9."/>
+      <w:lvlJc w:val="right"/>
+      <w:pPr>
+        <w:ind w:left="7200" w:hanging="180"/>
+      </w:pPr>
+    </w:lvl>
+  </w:abstractNum>
+  <w:abstractNum w:abstractNumId="17" w15:restartNumberingAfterBreak="0">
     <w:nsid w:val="677F303E"/>
     <w:multiLevelType w:val="hybridMultilevel"/>
     <w:tmpl w:val="899A6960"/>
@@ -2579,7 +4313,96 @@
       </w:rPr>
     </w:lvl>
   </w:abstractNum>
-  <w:abstractNum w:abstractNumId="8" w15:restartNumberingAfterBreak="0">
+  <w:abstractNum w:abstractNumId="18" w15:restartNumberingAfterBreak="0">
+    <w:nsid w:val="6A7B2C3E"/>
+    <w:multiLevelType w:val="hybridMultilevel"/>
+    <w:tmpl w:val="FB6E3680"/>
+    <w:lvl w:ilvl="0" w:tplc="4A423A82">
+      <w:start w:val="1"/>
+      <w:numFmt w:val="decimal"/>
+      <w:lvlText w:val="%1."/>
+      <w:lvlJc w:val="left"/>
+      <w:pPr>
+        <w:ind w:left="1364" w:hanging="360"/>
+      </w:pPr>
+      <w:rPr>
+        <w:rFonts w:hint="default"/>
+      </w:rPr>
+    </w:lvl>
+    <w:lvl w:ilvl="1" w:tplc="100C0019" w:tentative="1">
+      <w:start w:val="1"/>
+      <w:numFmt w:val="lowerLetter"/>
+      <w:lvlText w:val="%2."/>
+      <w:lvlJc w:val="left"/>
+      <w:pPr>
+        <w:ind w:left="1724" w:hanging="360"/>
+      </w:pPr>
+    </w:lvl>
+    <w:lvl w:ilvl="2" w:tplc="100C001B" w:tentative="1">
+      <w:start w:val="1"/>
+      <w:numFmt w:val="lowerRoman"/>
+      <w:lvlText w:val="%3."/>
+      <w:lvlJc w:val="right"/>
+      <w:pPr>
+        <w:ind w:left="2444" w:hanging="180"/>
+      </w:pPr>
+    </w:lvl>
+    <w:lvl w:ilvl="3" w:tplc="100C000F" w:tentative="1">
+      <w:start w:val="1"/>
+      <w:numFmt w:val="decimal"/>
+      <w:lvlText w:val="%4."/>
+      <w:lvlJc w:val="left"/>
+      <w:pPr>
+        <w:ind w:left="3164" w:hanging="360"/>
+      </w:pPr>
+    </w:lvl>
+    <w:lvl w:ilvl="4" w:tplc="100C0019" w:tentative="1">
+      <w:start w:val="1"/>
+      <w:numFmt w:val="lowerLetter"/>
+      <w:lvlText w:val="%5."/>
+      <w:lvlJc w:val="left"/>
+      <w:pPr>
+        <w:ind w:left="3884" w:hanging="360"/>
+      </w:pPr>
+    </w:lvl>
+    <w:lvl w:ilvl="5" w:tplc="100C001B" w:tentative="1">
+      <w:start w:val="1"/>
+      <w:numFmt w:val="lowerRoman"/>
+      <w:lvlText w:val="%6."/>
+      <w:lvlJc w:val="right"/>
+      <w:pPr>
+        <w:ind w:left="4604" w:hanging="180"/>
+      </w:pPr>
+    </w:lvl>
+    <w:lvl w:ilvl="6" w:tplc="100C000F" w:tentative="1">
+      <w:start w:val="1"/>
+      <w:numFmt w:val="decimal"/>
+      <w:lvlText w:val="%7."/>
+      <w:lvlJc w:val="left"/>
+      <w:pPr>
+        <w:ind w:left="5324" w:hanging="360"/>
+      </w:pPr>
+    </w:lvl>
+    <w:lvl w:ilvl="7" w:tplc="100C0019" w:tentative="1">
+      <w:start w:val="1"/>
+      <w:numFmt w:val="lowerLetter"/>
+      <w:lvlText w:val="%8."/>
+      <w:lvlJc w:val="left"/>
+      <w:pPr>
+        <w:ind w:left="6044" w:hanging="360"/>
+      </w:pPr>
+    </w:lvl>
+    <w:lvl w:ilvl="8" w:tplc="100C001B" w:tentative="1">
+      <w:start w:val="1"/>
+      <w:numFmt w:val="lowerRoman"/>
+      <w:lvlText w:val="%9."/>
+      <w:lvlJc w:val="right"/>
+      <w:pPr>
+        <w:ind w:left="6764" w:hanging="180"/>
+      </w:pPr>
+    </w:lvl>
+  </w:abstractNum>
+  <w:abstractNum w:abstractNumId="19" w15:restartNumberingAfterBreak="0">
     <w:nsid w:val="707636A1"/>
     <w:multiLevelType w:val="hybridMultilevel"/>
     <w:tmpl w:val="3A3C94F0"/>
@@ -2692,7 +4515,7 @@
       </w:rPr>
     </w:lvl>
   </w:abstractNum>
-  <w:abstractNum w:abstractNumId="9" w15:restartNumberingAfterBreak="0">
+  <w:abstractNum w:abstractNumId="20" w15:restartNumberingAfterBreak="0">
     <w:nsid w:val="770544FC"/>
     <w:multiLevelType w:val="hybridMultilevel"/>
     <w:tmpl w:val="9398CAF8"/>
@@ -2806,49 +4629,82 @@
     </w:lvl>
   </w:abstractNum>
   <w:num w:numId="1">
+    <w:abstractNumId w:val="9"/>
+  </w:num>
+  <w:num w:numId="2">
+    <w:abstractNumId w:val="9"/>
+  </w:num>
+  <w:num w:numId="3">
+    <w:abstractNumId w:val="9"/>
+  </w:num>
+  <w:num w:numId="4">
+    <w:abstractNumId w:val="9"/>
+  </w:num>
+  <w:num w:numId="5">
+    <w:abstractNumId w:val="9"/>
+  </w:num>
+  <w:num w:numId="6">
+    <w:abstractNumId w:val="9"/>
+  </w:num>
+  <w:num w:numId="7">
+    <w:abstractNumId w:val="17"/>
+  </w:num>
+  <w:num w:numId="8">
+    <w:abstractNumId w:val="19"/>
+  </w:num>
+  <w:num w:numId="9">
+    <w:abstractNumId w:val="7"/>
+  </w:num>
+  <w:num w:numId="10">
+    <w:abstractNumId w:val="10"/>
+  </w:num>
+  <w:num w:numId="11">
+    <w:abstractNumId w:val="20"/>
+  </w:num>
+  <w:num w:numId="12">
+    <w:abstractNumId w:val="11"/>
+  </w:num>
+  <w:num w:numId="13">
+    <w:abstractNumId w:val="6"/>
+  </w:num>
+  <w:num w:numId="14">
+    <w:abstractNumId w:val="13"/>
+  </w:num>
+  <w:num w:numId="15">
+    <w:abstractNumId w:val="2"/>
+  </w:num>
+  <w:num w:numId="16">
+    <w:abstractNumId w:val="5"/>
+  </w:num>
+  <w:num w:numId="17">
+    <w:abstractNumId w:val="4"/>
+  </w:num>
+  <w:num w:numId="18">
+    <w:abstractNumId w:val="0"/>
+  </w:num>
+  <w:num w:numId="19">
+    <w:abstractNumId w:val="16"/>
+  </w:num>
+  <w:num w:numId="20">
     <w:abstractNumId w:val="3"/>
   </w:num>
-  <w:num w:numId="2">
-    <w:abstractNumId w:val="3"/>
+  <w:num w:numId="21">
+    <w:abstractNumId w:val="18"/>
   </w:num>
-  <w:num w:numId="3">
-    <w:abstractNumId w:val="3"/>
+  <w:num w:numId="22">
+    <w:abstractNumId w:val="12"/>
   </w:num>
-  <w:num w:numId="4">
-    <w:abstractNumId w:val="3"/>
+  <w:num w:numId="23">
+    <w:abstractNumId w:val="14"/>
   </w:num>
-  <w:num w:numId="5">
-    <w:abstractNumId w:val="3"/>
+  <w:num w:numId="24">
+    <w:abstractNumId w:val="15"/>
   </w:num>
-  <w:num w:numId="6">
-    <w:abstractNumId w:val="3"/>
-  </w:num>
-  <w:num w:numId="7">
-    <w:abstractNumId w:val="7"/>
-  </w:num>
-  <w:num w:numId="8">
-    <w:abstractNumId w:val="8"/>
-  </w:num>
-  <w:num w:numId="9">
-    <w:abstractNumId w:val="2"/>
-  </w:num>
-  <w:num w:numId="10">
-    <w:abstractNumId w:val="4"/>
-  </w:num>
-  <w:num w:numId="11">
-    <w:abstractNumId w:val="9"/>
-  </w:num>
-  <w:num w:numId="12">
-    <w:abstractNumId w:val="5"/>
-  </w:num>
-  <w:num w:numId="13">
+  <w:num w:numId="25">
     <w:abstractNumId w:val="1"/>
   </w:num>
-  <w:num w:numId="14">
-    <w:abstractNumId w:val="6"/>
-  </w:num>
-  <w:num w:numId="15">
-    <w:abstractNumId w:val="0"/>
+  <w:num w:numId="26">
+    <w:abstractNumId w:val="8"/>
   </w:num>
 </w:numbering>
 </file>
@@ -4182,6 +6038,15 @@
 </file>
 
 <file path=customXml/item1.xml><?xml version="1.0" encoding="utf-8"?>
+<?mso-contentType ?>
+<FormTemplates xmlns="http://schemas.microsoft.com/sharepoint/v3/contenttype/forms">
+  <Display>DocumentLibraryForm</Display>
+  <Edit>DocumentLibraryForm</Edit>
+  <New>DocumentLibraryForm</New>
+</FormTemplates>
+</file>
+
+<file path=customXml/item2.xml><?xml version="1.0" encoding="utf-8"?>
 <ct:contentTypeSchema xmlns:ct="http://schemas.microsoft.com/office/2006/metadata/contentType" xmlns:ma="http://schemas.microsoft.com/office/2006/metadata/properties/metaAttributes" ct:_="" ma:_="" ma:contentTypeName="Document" ma:contentTypeID="0x010100B0BC76B2D102614AB68281AB1B3655C7" ma:contentTypeVersion="18" ma:contentTypeDescription="Crée un document." ma:contentTypeScope="" ma:versionID="a5ba1717af84e34c0a7143409c151512">
   <xsd:schema xmlns:xsd="http://www.w3.org/2001/XMLSchema" xmlns:xs="http://www.w3.org/2001/XMLSchema" xmlns:p="http://schemas.microsoft.com/office/2006/metadata/properties" xmlns:ns2="855f036e-00a9-480e-8309-7c710e134e0a" xmlns:ns3="f7d9f5a6-831d-4621-8c77-cbcaf993e406" targetNamespace="http://schemas.microsoft.com/office/2006/metadata/properties" ma:root="true" ma:fieldsID="952f49621ca0688a3265094fe61dcb0c" ns2:_="" ns3:_="">
     <xsd:import namespace="855f036e-00a9-480e-8309-7c710e134e0a"/>
@@ -4436,16 +6301,11 @@
 </ct:contentTypeSchema>
 </file>
 
-<file path=customXml/item2.xml><?xml version="1.0" encoding="utf-8"?>
-<?mso-contentType ?>
-<FormTemplates xmlns="http://schemas.microsoft.com/sharepoint/v3/contenttype/forms">
-  <Display>DocumentLibraryForm</Display>
-  <Edit>DocumentLibraryForm</Edit>
-  <New>DocumentLibraryForm</New>
-</FormTemplates>
+<file path=customXml/item3.xml><?xml version="1.0" encoding="utf-8"?>
+<b:Sources xmlns:b="http://schemas.openxmlformats.org/officeDocument/2006/bibliography" xmlns="http://schemas.openxmlformats.org/officeDocument/2006/bibliography" SelectedStyle="\APA.XSL" StyleName="APA"/>
 </file>
 
-<file path=customXml/item3.xml><?xml version="1.0" encoding="utf-8"?>
+<file path=customXml/item4.xml><?xml version="1.0" encoding="utf-8"?>
 <p:properties xmlns:p="http://schemas.microsoft.com/office/2006/metadata/properties" xmlns:xsi="http://www.w3.org/2001/XMLSchema-instance" xmlns:pc="http://schemas.microsoft.com/office/infopath/2007/PartnerControls">
   <documentManagement>
     <TaxCatchAll xmlns="f7d9f5a6-831d-4621-8c77-cbcaf993e406" xsi:nil="true"/>
@@ -4456,11 +6316,15 @@
 </p:properties>
 </file>
 
-<file path=customXml/item4.xml><?xml version="1.0" encoding="utf-8"?>
-<b:Sources xmlns:b="http://schemas.openxmlformats.org/officeDocument/2006/bibliography" xmlns="http://schemas.openxmlformats.org/officeDocument/2006/bibliography" SelectedStyle="\APA.XSL" StyleName="APA"/>
+<file path=customXml/itemProps1.xml><?xml version="1.0" encoding="utf-8"?>
+<ds:datastoreItem xmlns:ds="http://schemas.openxmlformats.org/officeDocument/2006/customXml" ds:itemID="{631FEB60-E730-4A14-9F50-5235805E0623}">
+  <ds:schemaRefs>
+    <ds:schemaRef ds:uri="http://schemas.microsoft.com/sharepoint/v3/contenttype/forms"/>
+  </ds:schemaRefs>
+</ds:datastoreItem>
 </file>
 
-<file path=customXml/itemProps1.xml><?xml version="1.0" encoding="utf-8"?>
+<file path=customXml/itemProps2.xml><?xml version="1.0" encoding="utf-8"?>
 <ds:datastoreItem xmlns:ds="http://schemas.openxmlformats.org/officeDocument/2006/customXml" ds:itemID="{95F33295-DF49-4D67-A3FF-035C0D3248EC}">
   <ds:schemaRefs>
     <ds:schemaRef ds:uri="http://schemas.microsoft.com/office/2006/metadata/contentType"/>
@@ -4479,15 +6343,15 @@
 </ds:datastoreItem>
 </file>
 
-<file path=customXml/itemProps2.xml><?xml version="1.0" encoding="utf-8"?>
-<ds:datastoreItem xmlns:ds="http://schemas.openxmlformats.org/officeDocument/2006/customXml" ds:itemID="{631FEB60-E730-4A14-9F50-5235805E0623}">
+<file path=customXml/itemProps3.xml><?xml version="1.0" encoding="utf-8"?>
+<ds:datastoreItem xmlns:ds="http://schemas.openxmlformats.org/officeDocument/2006/customXml" ds:itemID="{291CC5BD-35A6-41A9-B261-BC636867E62C}">
   <ds:schemaRefs>
-    <ds:schemaRef ds:uri="http://schemas.microsoft.com/sharepoint/v3/contenttype/forms"/>
+    <ds:schemaRef ds:uri="http://schemas.openxmlformats.org/officeDocument/2006/bibliography"/>
   </ds:schemaRefs>
 </ds:datastoreItem>
 </file>
 
-<file path=customXml/itemProps3.xml><?xml version="1.0" encoding="utf-8"?>
+<file path=customXml/itemProps4.xml><?xml version="1.0" encoding="utf-8"?>
 <ds:datastoreItem xmlns:ds="http://schemas.openxmlformats.org/officeDocument/2006/customXml" ds:itemID="{F8681EE4-451D-4DD6-810D-0A09C9094768}">
   <ds:schemaRefs>
     <ds:schemaRef ds:uri="http://schemas.microsoft.com/office/2006/metadata/properties"/>
@@ -4496,12 +6360,4 @@
     <ds:schemaRef ds:uri="855f036e-00a9-480e-8309-7c710e134e0a"/>
   </ds:schemaRefs>
 </ds:datastoreItem>
-</file>
-
-<file path=customXml/itemProps4.xml><?xml version="1.0" encoding="utf-8"?>
-<ds:datastoreItem xmlns:ds="http://schemas.openxmlformats.org/officeDocument/2006/customXml" ds:itemID="{291CC5BD-35A6-41A9-B261-BC636867E62C}">
-  <ds:schemaRefs>
-    <ds:schemaRef ds:uri="http://schemas.openxmlformats.org/officeDocument/2006/bibliography"/>
-  </ds:schemaRefs>
-</ds:datastoreItem>
 </file>
</xml_diff>